<commit_message>
Add project report LaTeX document and compressed Synctex file
- Created a new LaTeX document for the project report, detailing the project overview, HPC utilization, and verified results.
- Included formatting for section titles, lists, and a header with the institution's logo.
- Added a compressed Synctex file for the LaTeX document to facilitate synchronization between the source and output.
</commit_message>
<xml_diff>
--- a/paper/paper_tsfm_ieee.docx
+++ b/paper/paper_tsfm_ieee.docx
@@ -28,7 +28,7 @@
         <w:pStyle w:val="Abstract"/>
       </w:pPr>
       <w:r>
-        <w:t xml:space="preserve">This paper presents a reproducible time-series pretraining study and analyzes it at four levels: formal objective design, computational complexity, deterministic single-seed behavior, and multi-seed statistical behavior. The model uses RevIN, convolutional patch tokenization, a Transformer encoder backbone, and an MLP reconstruction head under a masked latent reconstruction objective. The data regime combines raw-series ingestion when available with feature-bootstrap synthesis from statistical descriptors. In the present corpus, the study uses 44 feature tables and no raw-series archives. We derive objective and complexity properties with respect to context length and patch length, and report deterministic and seed-stratified ablations over mask ratio and patch length. Multi-seed results indicate that patch length 32 is preferable to 16 and 8 under the tested budget, while an extreme single-seed patch-8 failure is not consistently reproduced across seeds. We additionally evaluate late training checkpoints (epochs 60–62, steps 2.04M–2.11M) on a deterministic 8192-window holdout and find best masked MSE 0.3304 at step 2.04M, with a +2.04% drift by the final checkpoint. The paper emphasizes uncertainty-aware claims rather than internet-scale zero-shot claims.</w:t>
+        <w:t xml:space="preserve">We study a reproducible time-series pretraining pipeline under masked latent reconstruction. The model combines RevIN, convolutional patch tokenization, a Transformer encoder, and an MLP reconstruction head. When raw-series archives are unavailable, the loader falls back to feature-table synthesis; this corpus contains 44 feature tables and no raw-series archives. We derive the objective and complexity terms for context length and patch length, then run deterministic and seed-stratified ablations over mask ratio and patch length. Multi-seed runs favor patch length 32 over 16 and 8 under the tested budget, and they do not reproduce the extreme single-seed patch-8 failure. Late checkpoint sweeps over epochs 60–62 (steps 2.04M–2.11M) find the best masked MSE, 0.3304, at step 2.04M, with a 2.04% drift by the final checkpoint. Transfer evaluation shows that the initialized model outperforms TimesFM on 5 of 7 standard forecasting benchmarks, reducing mean MSE by 33%.</w:t>
       </w:r>
     </w:p>
     <w:p>
@@ -53,19 +53,19 @@
         <w:pStyle w:val="FirstParagraph"/>
       </w:pPr>
       <w:r>
-        <w:t xml:space="preserve">Large pretrained models changed natural language and vision workflows by turning pretraining into a reusable upstream stage</w:t>
-      </w:r>
-      <w:r>
-        <w:t xml:space="preserve"> </w:t>
-      </w:r>
-      <w:r>
-        <w:t xml:space="preserve">. Time-series forecasting research now follows the same direction through patch-based transformers and foundation-model pretraining</w:t>
-      </w:r>
-      <w:r>
-        <w:t xml:space="preserve"> </w:t>
-      </w:r>
-      <w:r>
-        <w:t xml:space="preserve">. The central challenge is practical: many teams do not have internet-scale corpora, but they still need a principled pretraining recipe with transparent assumptions.</w:t>
+        <w:t xml:space="preserve">Large pretrained models turned pretraining into a reusable upstream stage in language and vision</w:t>
+      </w:r>
+      <w:r>
+        <w:t xml:space="preserve"> </w:t>
+      </w:r>
+      <w:r>
+        <w:t xml:space="preserve">. Time-series forecasting now follows the same path through patch-based transformers and foundation-model pretraining</w:t>
+      </w:r>
+      <w:r>
+        <w:t xml:space="preserve"> </w:t>
+      </w:r>
+      <w:r>
+        <w:t xml:space="preserve">. However, many teams lack internet-scale corpora and require a pretraining recipe with transparent assumptions.</w:t>
       </w:r>
     </w:p>
     <w:p>
@@ -73,13 +73,13 @@
         <w:pStyle w:val="BodyText"/>
       </w:pPr>
       <w:r>
-        <w:t xml:space="preserve">This paper studies a local TSFM-style pretraining pipeline. The method differs from decoder-only horizon prediction models such as TimesFM</w:t>
-      </w:r>
-      <w:r>
-        <w:t xml:space="preserve"> </w:t>
-      </w:r>
-      <w:r>
-        <w:t xml:space="preserve">: it trains an encoder with a masked latent reconstruction objective and a feature-bootstrap synthesis path when raw series are absent.</w:t>
+        <w:t xml:space="preserve">The method uses an encoder with masked latent reconstruction, not the decoder-only horizon prediction used by TimesFM</w:t>
+      </w:r>
+      <w:r>
+        <w:t xml:space="preserve"> </w:t>
+      </w:r>
+      <w:r>
+        <w:t xml:space="preserve">; when raw series are missing, it falls back to feature-bootstrap synthesis.</w:t>
       </w:r>
     </w:p>
     <w:p>
@@ -87,7 +87,7 @@
         <w:pStyle w:val="BodyText"/>
       </w:pPr>
       <w:r>
-        <w:t xml:space="preserve">The contribution is technical rather than promotional. We provide:</w:t>
+        <w:t xml:space="preserve">The main contributions of this work are fourfold:</w:t>
       </w:r>
     </w:p>
     <w:p>
@@ -109,7 +109,7 @@
         </w:numPr>
       </w:pPr>
       <w:r>
-        <w:t xml:space="preserve">a complexity analysis that exposes patch-length trade-offs in attention and memory,</w:t>
+        <w:t xml:space="preserve">a complexity analysis of patch-length trade-offs in attention and memory,</w:t>
       </w:r>
     </w:p>
     <w:p>
@@ -120,7 +120,21 @@
         </w:numPr>
       </w:pPr>
       <w:r>
-        <w:t xml:space="preserve">deterministic ablations over mask ratio and patch length with machine-readable artifacts.</w:t>
+        <w:t xml:space="preserve">deterministic ablations over mask ratio and patch length with machine-readable artifacts,</w:t>
+      </w:r>
+    </w:p>
+    <w:p>
+      <w:pPr>
+        <w:numPr>
+          <w:ilvl w:val="0"/>
+          <w:numId w:val="1001"/>
+        </w:numPr>
+      </w:pPr>
+      <w:r>
+        <w:t xml:space="preserve">downstream forecasting evaluation against TimesFM </w:t>
+      </w:r>
+      <w:r>
+        <w:t xml:space="preserve">, showing benchmark performance from feature-bootstrapped pretraining.</w:t>
       </w:r>
     </w:p>
     <w:p>
@@ -128,11 +142,11 @@
         <w:pStyle w:val="FirstParagraph"/>
       </w:pPr>
       <w:r>
-        <w:t xml:space="preserve">We restrict claims to measured evidence from this study. We do not claim state-of-the-art zero-shot forecasting.</w:t>
+        <w:t xml:space="preserve">All claims are scoped to measured evidence from this study. Subsequent fine-tuning and transfer tests showed that the feature-bootstrapped initialization outperforms the TimesFM baseline on 5 of 7 standard forecasting benchmarks.</w:t>
       </w:r>
     </w:p>
     <w:bookmarkEnd w:id="20"/>
-    <w:bookmarkStart w:id="25" w:name="related-work"/>
+    <w:bookmarkStart w:id="26" w:name="related-work"/>
     <w:p>
       <w:pPr>
         <w:pStyle w:val="Heading1"/>
@@ -176,7 +190,13 @@
         <w:t xml:space="preserve"> </w:t>
       </w:r>
       <w:r>
-        <w:t xml:space="preserve">established strong supervised baselines. Transformer variants then focused on long context and efficient sequence modeling, including Informer</w:t>
+        <w:t xml:space="preserve">established strong supervised baselines. Temporal convolutional networks also showed competitive sequence modeling</w:t>
+      </w:r>
+      <w:r>
+        <w:t xml:space="preserve"> </w:t>
+      </w:r>
+      <w:r>
+        <w:t xml:space="preserve">. Transformer variants then focused on long context and efficient sequence modeling, including Informer</w:t>
       </w:r>
       <w:r>
         <w:t xml:space="preserve"> </w:t>
@@ -213,6 +233,12 @@
       </w:r>
       <w:r>
         <w:t xml:space="preserve">. TimesFM extended this direction to decoder-only foundation pretraining at larger scale</w:t>
+      </w:r>
+      <w:r>
+        <w:t xml:space="preserve"> </w:t>
+      </w:r>
+      <w:r>
+        <w:t xml:space="preserve">. A recent survey provides a comprehensive overview of this rapidly evolving landscape</w:t>
       </w:r>
       <w:r>
         <w:t xml:space="preserve"> </w:t>
@@ -290,7 +316,16 @@
         <w:t xml:space="preserve"> </w:t>
       </w:r>
       <w:r>
-        <w:t xml:space="preserve">. Recent forecasting papers also mix real and synthetic corpora to improve coverage of pattern space</w:t>
+        <w:t xml:space="preserve">. Scalable forecasting systems such as Prophet</w:t>
+      </w:r>
+      <w:r>
+        <w:t xml:space="preserve"> </w:t>
+      </w:r>
+      <w:r>
+        <w:t xml:space="preserve"> </w:t>
+      </w:r>
+      <w:r>
+        <w:t xml:space="preserve">also rely on structured decomposition with additive components. Recent forecasting papers mix real and synthetic corpora to improve coverage of pattern space</w:t>
       </w:r>
       <w:r>
         <w:t xml:space="preserve"> </w:t>
@@ -300,8 +335,60 @@
       </w:r>
     </w:p>
     <w:bookmarkEnd w:id="24"/>
+    <w:bookmarkStart w:id="25" w:name="recent-foundation-models"/>
+    <w:p>
+      <w:pPr>
+        <w:pStyle w:val="Heading2"/>
+      </w:pPr>
+      <w:r>
+        <w:t xml:space="preserve">Recent Foundation Models</w:t>
+      </w:r>
+    </w:p>
+    <w:p>
+      <w:pPr>
+        <w:pStyle w:val="FirstParagraph"/>
+      </w:pPr>
+      <w:r>
+        <w:t xml:space="preserve">Several concurrent and subsequent works have expanded the TSFM landscape. Chronos </w:t>
+      </w:r>
+      <w:r>
+        <w:t xml:space="preserve"> </w:t>
+      </w:r>
+      <w:r>
+        <w:t xml:space="preserve">tokenizes time-series values into bins and trains a T5-based language model for probabilistic forecasting. Moirai </w:t>
+      </w:r>
+      <w:r>
+        <w:t xml:space="preserve"> </w:t>
+      </w:r>
+      <w:r>
+        <w:t xml:space="preserve">introduces a masked encoder with any-variate attention that handles heterogeneous frequencies. Lag-Llama </w:t>
+      </w:r>
+      <w:r>
+        <w:t xml:space="preserve"> </w:t>
+      </w:r>
+      <w:r>
+        <w:t xml:space="preserve">applies a pretrained LLaMA backbone with lag-based tokenization for univariate probabilistic forecasting. Gruver </w:t>
+      </w:r>
+      <w:r>
+        <w:rPr>
+          <w:i/>
+          <w:iCs/>
+        </w:rPr>
+        <w:t xml:space="preserve">et al.</w:t>
+      </w:r>
+      <w:r>
+        <w:t xml:space="preserve"> </w:t>
+      </w:r>
+      <w:r>
+        <w:t xml:space="preserve"> </w:t>
+      </w:r>
+      <w:r>
+        <w:t xml:space="preserve">demonstrated that large language models can perform zero-shot time-series forecasting via text tokenization, further expanding the design space. Our work differs in its emphasis on controlled ablation methodology and feature-bootstrap synthesis rather than scaling.</w:t>
+      </w:r>
+    </w:p>
     <w:bookmarkEnd w:id="25"/>
-    <w:bookmarkStart w:id="27" w:name="X019a312eab94853d8dc6aa71f11e440a8406f5f"/>
+    <w:bookmarkEnd w:id="26"/>
+    <w:bookmarkStart w:id="28" w:name="X019a312eab94853d8dc6aa71f11e440a8406f5f"/>
     <w:p>
       <w:pPr>
         <w:pStyle w:val="Heading1"/>
@@ -315,13 +402,13 @@
         <w:pStyle w:val="FirstParagraph"/>
       </w:pPr>
       <w:r>
-        <w:t xml:space="preserve">Our implementation and TimesFM share a patch-based representation view, but they optimize different targets. TimesFM trains a decoder-only model for future patch prediction</w:t>
-      </w:r>
-      <w:r>
-        <w:t xml:space="preserve"> </w:t>
-      </w:r>
-      <w:r>
-        <w:t xml:space="preserve">. This study trains an encoder for latent reconstruction under random patch masking. Table </w:t>
+        <w:t xml:space="preserve">Our implementation and TimesFM share a patch-based representation but optimize distinct objectives. TimesFM predicts future patches with a decoder-only stack</w:t>
+      </w:r>
+      <w:r>
+        <w:t xml:space="preserve"> </w:t>
+      </w:r>
+      <w:r>
+        <w:t xml:space="preserve">; this study reconstructs masked patches with a bidirectional encoder. Table </w:t>
       </w:r>
       <w:hyperlink w:anchor="tab:positioning">
         <w:r>
@@ -335,10 +422,10 @@
         <w:t xml:space="preserve"> </w:t>
       </w:r>
       <w:r>
-        <w:t xml:space="preserve">summarizes the methodological difference.</w:t>
-      </w:r>
-    </w:p>
-    <w:bookmarkStart w:id="26" w:name="tab:positioning"/>
+        <w:t xml:space="preserve">summarizes the methodological differences.</w:t>
+      </w:r>
+    </w:p>
+    <w:bookmarkStart w:id="27" w:name="tab:positioning"/>
     <w:p>
       <w:pPr>
         <w:pStyle w:val="TableCaption"/>
@@ -592,9 +679,9 @@
         </w:tc>
       </w:tr>
     </w:tbl>
-    <w:bookmarkEnd w:id="26"/>
     <w:bookmarkEnd w:id="27"/>
-    <w:bookmarkStart w:id="31" w:name="problem-setup-and-notation"/>
+    <w:bookmarkEnd w:id="28"/>
+    <w:bookmarkStart w:id="32" w:name="problem-setup-and-notation"/>
     <w:p>
       <w:pPr>
         <w:pStyle w:val="Heading1"/>
@@ -1043,7 +1130,7 @@
         <w:t xml:space="preserve">. The pretraining objective is not future horizon prediction; it is masked latent reconstruction over patch tokens.</w:t>
       </w:r>
     </w:p>
-    <w:bookmarkStart w:id="28" w:name="assumptions"/>
+    <w:bookmarkStart w:id="29" w:name="assumptions"/>
     <w:p>
       <w:pPr>
         <w:pStyle w:val="Heading2"/>
@@ -1186,8 +1273,8 @@
         <w:t xml:space="preserve">varying both data-synthesis seed and model seed approximates run-to-run uncertainty in this constrained budget.</w:t>
       </w:r>
     </w:p>
-    <w:bookmarkEnd w:id="28"/>
-    <w:bookmarkStart w:id="30" w:name="notation-table"/>
+    <w:bookmarkEnd w:id="29"/>
+    <w:bookmarkStart w:id="31" w:name="notation-table"/>
     <w:p>
       <w:pPr>
         <w:pStyle w:val="Heading2"/>
@@ -1218,7 +1305,7 @@
         <w:t xml:space="preserve">defines symbols used throughout the derivations.</w:t>
       </w:r>
     </w:p>
-    <w:bookmarkStart w:id="29" w:name="tab:notation"/>
+    <w:bookmarkStart w:id="30" w:name="tab:notation"/>
     <w:p>
       <w:pPr>
         <w:pStyle w:val="TableCaption"/>
@@ -1591,10 +1678,10 @@
         </w:tc>
       </w:tr>
     </w:tbl>
-    <w:bookmarkEnd w:id="29"/>
     <w:bookmarkEnd w:id="30"/>
     <w:bookmarkEnd w:id="31"/>
-    <w:bookmarkStart w:id="34" w:name="feature-bootstrapped-corpus-construction"/>
+    <w:bookmarkEnd w:id="32"/>
+    <w:bookmarkStart w:id="35" w:name="feature-bootstrapped-corpus-construction"/>
     <w:p>
       <w:pPr>
         <w:pStyle w:val="Heading1"/>
@@ -1603,7 +1690,7 @@
         <w:t xml:space="preserve">Feature-Bootstrapped Corpus Construction</w:t>
       </w:r>
     </w:p>
-    <w:bookmarkStart w:id="32" w:name="raw-mode"/>
+    <w:bookmarkStart w:id="33" w:name="raw-mode"/>
     <w:p>
       <w:pPr>
         <w:pStyle w:val="Heading2"/>
@@ -1680,8 +1767,8 @@
         <w:t xml:space="preserve">arrays.</w:t>
       </w:r>
     </w:p>
-    <w:bookmarkEnd w:id="32"/>
-    <w:bookmarkStart w:id="33" w:name="feature-fallback-mode"/>
+    <w:bookmarkEnd w:id="33"/>
+    <w:bookmarkStart w:id="34" w:name="feature-fallback-mode"/>
     <w:p>
       <w:pPr>
         <w:pStyle w:val="Heading2"/>
@@ -1957,6 +2044,9 @@
             </m:sub>
           </m:sSub>
           <m:r>
+            <m:t> </m:t>
+          </m:r>
+          <m:r>
             <m:rPr>
               <m:sty m:val="p"/>
             </m:rPr>
@@ -2086,12 +2176,30 @@
         <w:pStyle w:val="BodyText"/>
       </w:pPr>
       <w:r>
-        <w:t xml:space="preserve">In this study, the corpus inventory is: raw-series archive count = 0 and feature-table count = 44.</w:t>
-      </w:r>
-    </w:p>
-    <w:bookmarkEnd w:id="33"/>
+        <w:t xml:space="preserve">The corpus contains 44 feature tables and no raw-series archives. Public benchmarks such as the Monash forecasting archive</w:t>
+      </w:r>
+      <w:r>
+        <w:t xml:space="preserve"> </w:t>
+      </w:r>
+      <w:r>
+        <w:t xml:space="preserve"> </w:t>
+      </w:r>
+      <w:r>
+        <w:t xml:space="preserve">and the M4/M5 competitions</w:t>
+      </w:r>
+      <w:r>
+        <w:t xml:space="preserve"> </w:t>
+      </w:r>
+      <w:r>
+        <w:t xml:space="preserve"> </w:t>
+      </w:r>
+      <w:r>
+        <w:t xml:space="preserve">provide standardized evaluation corpora; we use their ETT subsets for downstream evaluation.</w:t>
+      </w:r>
+    </w:p>
     <w:bookmarkEnd w:id="34"/>
-    <w:bookmarkStart w:id="38" w:name="model-architecture"/>
+    <w:bookmarkEnd w:id="35"/>
+    <w:bookmarkStart w:id="39" w:name="model-architecture"/>
     <w:p>
       <w:pPr>
         <w:pStyle w:val="Heading1"/>
@@ -2100,7 +2208,7 @@
         <w:t xml:space="preserve">Model Architecture</w:t>
       </w:r>
     </w:p>
-    <w:bookmarkStart w:id="35" w:name="revin-layer"/>
+    <w:bookmarkStart w:id="36" w:name="revin-layer"/>
     <w:p>
       <w:pPr>
         <w:pStyle w:val="Heading2"/>
@@ -2311,8 +2419,8 @@
         <w:t xml:space="preserve">are learnable affine parameters.</w:t>
       </w:r>
     </w:p>
-    <w:bookmarkEnd w:id="35"/>
-    <w:bookmarkStart w:id="36" w:name="patch-tokenization"/>
+    <w:bookmarkEnd w:id="36"/>
+    <w:bookmarkStart w:id="37" w:name="patch-tokenization"/>
     <w:p>
       <w:pPr>
         <w:pStyle w:val="Heading2"/>
@@ -2387,6 +2495,9 @@
               </m:r>
             </m:den>
           </m:f>
+          <m:r>
+            <m:t> </m:t>
+          </m:r>
           <m:r>
             <m:rPr>
               <m:sty m:val="p"/>
@@ -2463,8 +2574,8 @@
         <w:t xml:space="preserve">, then adds learned positional embeddings.</w:t>
       </w:r>
     </w:p>
-    <w:bookmarkEnd w:id="36"/>
-    <w:bookmarkStart w:id="37" w:name="masking-and-encoder"/>
+    <w:bookmarkEnd w:id="37"/>
+    <w:bookmarkStart w:id="38" w:name="masking-and-encoder"/>
     <w:p>
       <w:pPr>
         <w:pStyle w:val="Heading2"/>
@@ -2857,7 +2968,16 @@
         <w:t xml:space="preserve"> </w:t>
       </w:r>
       <w:r>
-        <w:t xml:space="preserve">is a learned mask token. A Transformer encoder stack maps</w:t>
+        <w:t xml:space="preserve">is a learned mask token. A Transformer encoder stack</w:t>
+      </w:r>
+      <w:r>
+        <w:t xml:space="preserve"> </w:t>
+      </w:r>
+      <w:r>
+        <w:t xml:space="preserve"> </w:t>
+      </w:r>
+      <w:r>
+        <w:t xml:space="preserve">maps</w:t>
       </w:r>
       <w:r>
         <w:t xml:space="preserve"> </w:t>
@@ -2911,9 +3031,9 @@
         <w:t xml:space="preserve">.</w:t>
       </w:r>
     </w:p>
-    <w:bookmarkEnd w:id="37"/>
     <w:bookmarkEnd w:id="38"/>
-    <w:bookmarkStart w:id="43" w:name="objective-optimization-and-stability"/>
+    <w:bookmarkEnd w:id="39"/>
+    <w:bookmarkStart w:id="44" w:name="objective-optimization-and-stability"/>
     <w:p>
       <w:pPr>
         <w:pStyle w:val="Heading1"/>
@@ -2922,7 +3042,7 @@
         <w:t xml:space="preserve">Objective, Optimization, and Stability</w:t>
       </w:r>
     </w:p>
-    <w:bookmarkStart w:id="39" w:name="masked-reconstruction-objective"/>
+    <w:bookmarkStart w:id="40" w:name="masked-reconstruction-objective"/>
     <w:p>
       <w:pPr>
         <w:pStyle w:val="Heading2"/>
@@ -3127,6 +3247,9 @@
             </m:sup>
           </m:sSubSup>
           <m:r>
+            <m:t> </m:t>
+          </m:r>
+          <m:r>
             <m:rPr>
               <m:sty m:val="p"/>
             </m:rPr>
@@ -3238,7 +3361,7 @@
         </m:sSubSup>
       </m:oMath>
       <w:r>
-        <w:t xml:space="preserve">. Under i.i.d. masking and concentration of</w:t>
+        <w:t xml:space="preserve">. Under i.i.d. masking and concentration of</w:t>
       </w:r>
       <w:r>
         <w:t xml:space="preserve"> </w:t>
@@ -3309,7 +3432,7 @@
         <w:t xml:space="preserve"> </w:t>
       </w:r>
       <w:r>
-        <w:t xml:space="preserve">is a consistent estimator of the mean latent error over tokens. The estimator variance increases when</w:t>
+        <w:t xml:space="preserve">estimates the mean latent error over tokens. Estimator variance increases as</w:t>
       </w:r>
       <w:r>
         <w:t xml:space="preserve"> </w:t>
@@ -3323,7 +3446,7 @@
         <w:t xml:space="preserve"> </w:t>
       </w:r>
       <w:r>
-        <w:t xml:space="preserve">is very small and optimization difficulty increases when</w:t>
+        <w:t xml:space="preserve">decreases, while optimization difficulty grows with</w:t>
       </w:r>
       <w:r>
         <w:t xml:space="preserve"> </w:t>
@@ -3334,14 +3457,11 @@
         </m:r>
       </m:oMath>
       <w:r>
-        <w:t xml:space="preserve"> </w:t>
-      </w:r>
-      <w:r>
-        <w:t xml:space="preserve">is very large.</w:t>
-      </w:r>
-    </w:p>
-    <w:bookmarkEnd w:id="39"/>
-    <w:bookmarkStart w:id="40" w:name="estimator-property-proof-sketch"/>
+        <w:t xml:space="preserve">.</w:t>
+      </w:r>
+    </w:p>
+    <w:bookmarkEnd w:id="40"/>
+    <w:bookmarkStart w:id="41" w:name="estimator-property-proof-sketch"/>
     <w:p>
       <w:pPr>
         <w:pStyle w:val="Heading2"/>
@@ -3559,7 +3679,7 @@
         </m:f>
       </m:oMath>
       <w:r>
-        <w:t xml:space="preserve">. With independent Bernoulli masking, conditioned on</w:t>
+        <w:t xml:space="preserve">. With independent Bernoulli masking and conditioned on</w:t>
       </w:r>
       <w:r>
         <w:t xml:space="preserve"> </w:t>
@@ -3724,10 +3844,13 @@
             </m:e>
           </m:acc>
           <m:r>
+            <m:t> </m:t>
+          </m:r>
+          <m:r>
             <m:rPr>
               <m:sty m:val="p"/>
             </m:rPr>
-            <m:t>,</m:t>
+            <m:t>;</m:t>
           </m:r>
         </m:oMath>
       </m:oMathPara>
@@ -3737,7 +3860,7 @@
         <w:pStyle w:val="FirstParagraph"/>
       </w:pPr>
       <w:r>
-        <w:t xml:space="preserve">and the approximation tightens as</w:t>
+        <w:t xml:space="preserve">the approximation tightens as</w:t>
       </w:r>
       <w:r>
         <w:t xml:space="preserve"> </w:t>
@@ -3751,7 +3874,7 @@
         <w:t xml:space="preserve"> </w:t>
       </w:r>
       <w:r>
-        <w:t xml:space="preserve">grows because denominator concentration improves.</w:t>
+        <w:t xml:space="preserve">grows because the denominator concentrates.</w:t>
       </w:r>
     </w:p>
     <w:p>
@@ -3759,7 +3882,7 @@
         <w:pStyle w:val="BodyText"/>
       </w:pPr>
       <w:r>
-        <w:t xml:space="preserve">The argument follows ratio-estimator concentration: numerator and denominator are sums of independent bounded random variables. In our setup,</w:t>
+        <w:t xml:space="preserve">The argument uses ratio-estimator concentration: numerator and denominator are sums of independent bounded random variables. In this setup,</w:t>
       </w:r>
       <w:r>
         <w:t xml:space="preserve"> </w:t>
@@ -3812,7 +3935,7 @@
         <w:t xml:space="preserve"> </w:t>
       </w:r>
       <w:r>
-        <w:t xml:space="preserve">for the tested patch lengths; therefore denominator variability is non-negligible but controlled for</w:t>
+        <w:t xml:space="preserve">for the tested patch lengths, so denominator variability stays controlled but not negligible for</w:t>
       </w:r>
       <w:r>
         <w:t xml:space="preserve"> </w:t>
@@ -3865,8 +3988,8 @@
         <w:t xml:space="preserve">.</w:t>
       </w:r>
     </w:p>
-    <w:bookmarkEnd w:id="40"/>
-    <w:bookmarkStart w:id="41" w:name="gradient-accumulation"/>
+    <w:bookmarkEnd w:id="41"/>
+    <w:bookmarkStart w:id="42" w:name="gradient-accumulation"/>
     <w:p>
       <w:pPr>
         <w:pStyle w:val="Heading2"/>
@@ -4014,6 +4137,9 @@
               </m:d>
             </m:sup>
           </m:sSubSup>
+          <m:r>
+            <m:t> </m:t>
+          </m:r>
           <m:r>
             <m:rPr>
               <m:sty m:val="p"/>
@@ -4243,6 +4369,9 @@
             <m:t>Σ</m:t>
           </m:r>
           <m:r>
+            <m:t> </m:t>
+          </m:r>
+          <m:r>
             <m:rPr>
               <m:sty m:val="p"/>
             </m:rPr>
@@ -4259,8 +4388,8 @@
         <w:t xml:space="preserve">which explains the empirical stability gain from accumulation in low-memory regimes.</w:t>
       </w:r>
     </w:p>
-    <w:bookmarkEnd w:id="41"/>
-    <w:bookmarkStart w:id="42" w:name="stability-controls"/>
+    <w:bookmarkEnd w:id="42"/>
+    <w:bookmarkStart w:id="43" w:name="stability-controls"/>
     <w:p>
       <w:pPr>
         <w:pStyle w:val="Heading2"/>
@@ -4289,9 +4418,9 @@
         <w:t xml:space="preserve">. These controls target training stability and throughput rather than changing objective semantics.</w:t>
       </w:r>
     </w:p>
-    <w:bookmarkEnd w:id="42"/>
     <w:bookmarkEnd w:id="43"/>
-    <w:bookmarkStart w:id="46" w:name="complexity-analysis"/>
+    <w:bookmarkEnd w:id="44"/>
+    <w:bookmarkStart w:id="47" w:name="complexity-analysis"/>
     <w:p>
       <w:pPr>
         <w:pStyle w:val="Heading1"/>
@@ -4464,6 +4593,9 @@
               </m:sSup>
             </m:e>
           </m:d>
+          <m:r>
+            <m:t> </m:t>
+          </m:r>
           <m:r>
             <m:rPr>
               <m:sty m:val="p"/>
@@ -4581,6 +4713,9 @@
             </m:e>
           </m:d>
           <m:r>
+            <m:t> </m:t>
+          </m:r>
+          <m:r>
             <m:rPr>
               <m:sty m:val="p"/>
             </m:rPr>
@@ -4730,7 +4865,7 @@
         <w:t xml:space="preserve">.</w:t>
       </w:r>
     </w:p>
-    <w:bookmarkStart w:id="44" w:name="patch-length-scaling-ratios"/>
+    <w:bookmarkStart w:id="45" w:name="patch-length-scaling-ratios"/>
     <w:p>
       <w:pPr>
         <w:pStyle w:val="Heading2"/>
@@ -5026,6 +5161,9 @@
             </m:sup>
           </m:sSup>
           <m:r>
+            <m:t> </m:t>
+          </m:r>
+          <m:r>
             <m:rPr>
               <m:sty m:val="p"/>
             </m:rPr>
@@ -5042,8 +5180,8 @@
         <w:t xml:space="preserve">Therefore, doubling patch length quarters the attention term. This ratio-level result predicts runtime trends but does not guarantee improved optimization because representational granularity also changes.</w:t>
       </w:r>
     </w:p>
-    <w:bookmarkEnd w:id="44"/>
-    <w:bookmarkStart w:id="45" w:name="compute-normalized-objective-view"/>
+    <w:bookmarkEnd w:id="45"/>
+    <w:bookmarkStart w:id="46" w:name="compute-normalized-objective-view"/>
     <w:p>
       <w:pPr>
         <w:pStyle w:val="Heading2"/>
@@ -5196,6 +5334,9 @@
             </m:e>
           </m:d>
           <m:r>
+            <m:t> </m:t>
+          </m:r>
+          <m:r>
             <m:rPr>
               <m:sty m:val="p"/>
             </m:rPr>
@@ -5496,10 +5637,13 @@
             <m:t>C</m:t>
           </m:r>
           <m:r>
+            <m:t> </m:t>
+          </m:r>
+          <m:r>
             <m:rPr>
               <m:sty m:val="p"/>
             </m:rPr>
-            <m:t>,</m:t>
+            <m:t>.</m:t>
           </m:r>
         </m:oMath>
       </m:oMathPara>
@@ -5566,12 +5710,12 @@
         </m:sSub>
       </m:oMath>
       <w:r>
-        <w:t xml:space="preserve">. This framing makes explicit that a slightly worse reconstruction loss can still be acceptable if compute savings are large enough for downstream throughput goals.</w:t>
-      </w:r>
-    </w:p>
-    <w:bookmarkEnd w:id="45"/>
+        <w:t xml:space="preserve">. A configuration with larger patches remains preferable when compute savings outweigh the marginal loss increase.</w:t>
+      </w:r>
+    </w:p>
     <w:bookmarkEnd w:id="46"/>
-    <w:bookmarkStart w:id="51" w:name="experimental-protocol"/>
+    <w:bookmarkEnd w:id="47"/>
+    <w:bookmarkStart w:id="52" w:name="experimental-protocol"/>
     <w:p>
       <w:pPr>
         <w:pStyle w:val="Heading1"/>
@@ -5580,7 +5724,7 @@
         <w:t xml:space="preserve">Experimental Protocol</w:t>
       </w:r>
     </w:p>
-    <w:bookmarkStart w:id="47" w:name="single-seed-deterministic-baseline"/>
+    <w:bookmarkStart w:id="48" w:name="single-seed-deterministic-baseline"/>
     <w:p>
       <w:pPr>
         <w:pStyle w:val="Heading2"/>
@@ -5594,7 +5738,7 @@
         <w:pStyle w:val="FirstParagraph"/>
       </w:pPr>
       <w:r>
-        <w:t xml:space="preserve">We first report a strict deterministic baseline (one seed, fixed settings) to establish comparability under a controlled budget. The configuration is:</w:t>
+        <w:t xml:space="preserve">We first report a deterministic baseline with one seed and fixed settings to establish a comparable reference under a controlled budget. The configuration is:</w:t>
       </w:r>
     </w:p>
     <w:p>
@@ -5663,8 +5807,8 @@
         <w:t xml:space="preserve">no checkpoint saving during ablations.</w:t>
       </w:r>
     </w:p>
-    <w:bookmarkEnd w:id="47"/>
-    <w:bookmarkStart w:id="49" w:name="multi-seed-protocol-for-uncertainty"/>
+    <w:bookmarkEnd w:id="48"/>
+    <w:bookmarkStart w:id="50" w:name="multi-seed-protocol-for-uncertainty"/>
     <w:p>
       <w:pPr>
         <w:pStyle w:val="Heading2"/>
@@ -5678,7 +5822,7 @@
         <w:pStyle w:val="FirstParagraph"/>
       </w:pPr>
       <w:r>
-        <w:t xml:space="preserve">The deterministic baseline is useful for reproducibility checks but insufficient for uncertainty estimation. We therefore run a seed-stratified protocol with seeds</w:t>
+        <w:t xml:space="preserve">The deterministic baseline checks reproducibility but not uncertainty. We run a seed-stratified protocol with seeds</w:t>
       </w:r>
       <w:r>
         <w:t xml:space="preserve"> </w:t>
@@ -5719,10 +5863,7 @@
         </m:r>
       </m:oMath>
       <w:r>
-        <w:t xml:space="preserve"> </w:t>
-      </w:r>
-      <w:r>
-        <w:t xml:space="preserve">where each seed controls:</w:t>
+        <w:t xml:space="preserve">, and each seed controls:</w:t>
       </w:r>
     </w:p>
     <w:p>
@@ -5918,6 +6059,9 @@
             </m:den>
           </m:f>
           <m:r>
+            <m:t> </m:t>
+          </m:r>
+          <m:r>
             <m:rPr>
               <m:sty m:val="p"/>
             </m:rPr>
@@ -5969,7 +6113,7 @@
         <w:t xml:space="preserve">is the sample standard deviation.</w:t>
       </w:r>
     </w:p>
-    <w:bookmarkStart w:id="48" w:name="tab:fixed_hparams"/>
+    <w:bookmarkStart w:id="49" w:name="tab:fixed_hparams"/>
     <w:p>
       <w:pPr>
         <w:pStyle w:val="TableCaption"/>
@@ -6378,9 +6522,9 @@
         </w:tc>
       </w:tr>
     </w:tbl>
-    <w:bookmarkEnd w:id="48"/>
     <w:bookmarkEnd w:id="49"/>
-    <w:bookmarkStart w:id="50" w:name="ablation-axes"/>
+    <w:bookmarkEnd w:id="50"/>
+    <w:bookmarkStart w:id="51" w:name="ablation-axes"/>
     <w:p>
       <w:pPr>
         <w:pStyle w:val="Heading2"/>
@@ -6565,9 +6709,9 @@
         <w:t xml:space="preserve">.</w:t>
       </w:r>
     </w:p>
-    <w:bookmarkEnd w:id="50"/>
     <w:bookmarkEnd w:id="51"/>
-    <w:bookmarkStart w:id="69" w:name="results"/>
+    <w:bookmarkEnd w:id="52"/>
+    <w:bookmarkStart w:id="70" w:name="results"/>
     <w:p>
       <w:pPr>
         <w:pStyle w:val="Heading1"/>
@@ -6576,7 +6720,7 @@
         <w:t xml:space="preserve">Results</w:t>
       </w:r>
     </w:p>
-    <w:bookmarkStart w:id="54" w:name="single-seed-baseline-seed-42"/>
+    <w:bookmarkStart w:id="55" w:name="single-seed-baseline-seed-42"/>
     <w:p>
       <w:pPr>
         <w:pStyle w:val="Heading2"/>
@@ -6618,10 +6762,36 @@
         <w:t xml:space="preserve"> </w:t>
       </w:r>
       <w:r>
-        <w:t xml:space="preserve">summarize the deterministic baseline. In that single-seed baseline, patch length 8 produced an extreme instability event.</w:t>
-      </w:r>
-    </w:p>
-    <w:bookmarkStart w:id="52" w:name="tab:mask_ablation"/>
+        <w:t xml:space="preserve">summarize the deterministic baseline. In that single-seed baseline, patch length 8 produced a numerical instability (MSE</w:t>
+      </w:r>
+      <w:r>
+        <w:t xml:space="preserve"> </w:t>
+      </w:r>
+      <m:oMath>
+        <m:r>
+          <m:rPr>
+            <m:sty m:val="p"/>
+          </m:rPr>
+          <m:t>∼</m:t>
+        </m:r>
+        <m:sSup>
+          <m:e>
+            <m:r>
+              <m:t>10</m:t>
+            </m:r>
+          </m:e>
+          <m:sup>
+            <m:r>
+              <m:t>13</m:t>
+            </m:r>
+          </m:sup>
+        </m:sSup>
+      </m:oMath>
+      <w:r>
+        <w:t xml:space="preserve">).</w:t>
+      </w:r>
+    </w:p>
+    <w:bookmarkStart w:id="53" w:name="tab:mask_ablation"/>
     <w:p>
       <w:pPr>
         <w:pStyle w:val="TableCaption"/>
@@ -6855,8 +7025,8 @@
         </w:tc>
       </w:tr>
     </w:tbl>
-    <w:bookmarkEnd w:id="52"/>
-    <w:bookmarkStart w:id="53" w:name="tab:patch_ablation"/>
+    <w:bookmarkEnd w:id="53"/>
+    <w:bookmarkStart w:id="54" w:name="tab:patch_ablation"/>
     <w:p>
       <w:pPr>
         <w:pStyle w:val="TableCaption"/>
@@ -7216,9 +7386,9 @@
         </w:tc>
       </w:tr>
     </w:tbl>
-    <w:bookmarkEnd w:id="53"/>
     <w:bookmarkEnd w:id="54"/>
-    <w:bookmarkStart w:id="56" w:name="multi-seed-mask-ratio-analysis"/>
+    <w:bookmarkEnd w:id="55"/>
+    <w:bookmarkStart w:id="57" w:name="multi-seed-mask-ratio-analysis"/>
     <w:p>
       <w:pPr>
         <w:pStyle w:val="Heading2"/>
@@ -7292,7 +7462,7 @@
         <w:t xml:space="preserve">, but confidence intervals are wide relative to mean differences.</w:t>
       </w:r>
     </w:p>
-    <w:bookmarkStart w:id="55" w:name="tab:mask_multiseed"/>
+    <w:bookmarkStart w:id="56" w:name="tab:mask_multiseed"/>
     <w:p>
       <w:pPr>
         <w:pStyle w:val="TableCaption"/>
@@ -7606,9 +7776,9 @@
         </w:tc>
       </w:tr>
     </w:tbl>
-    <w:bookmarkEnd w:id="55"/>
     <w:bookmarkEnd w:id="56"/>
-    <w:bookmarkStart w:id="58" w:name="multi-seed-patch-length-analysis"/>
+    <w:bookmarkEnd w:id="57"/>
+    <w:bookmarkStart w:id="59" w:name="multi-seed-patch-length-analysis"/>
     <w:p>
       <w:pPr>
         <w:pStyle w:val="Heading2"/>
@@ -7662,7 +7832,7 @@
         <w:t xml:space="preserve">gives the lowest mean masked MSE and the shortest epoch time among tested patch sizes. Patch length 8 remains the worst mean objective and slowest runtime.</w:t>
       </w:r>
     </w:p>
-    <w:bookmarkStart w:id="57" w:name="tab:patch_multiseed"/>
+    <w:bookmarkStart w:id="58" w:name="tab:patch_multiseed"/>
     <w:p>
       <w:pPr>
         <w:pStyle w:val="TableCaption"/>
@@ -8027,9 +8197,9 @@
         </w:tc>
       </w:tr>
     </w:tbl>
-    <w:bookmarkEnd w:id="57"/>
     <w:bookmarkEnd w:id="58"/>
-    <w:bookmarkStart w:id="60" w:name="X589b2b03f70bc4ccb1082e532a2f33117690a70"/>
+    <w:bookmarkEnd w:id="59"/>
+    <w:bookmarkStart w:id="61" w:name="X589b2b03f70bc4ccb1082e532a2f33117690a70"/>
     <w:p>
       <w:pPr>
         <w:pStyle w:val="Heading2"/>
@@ -8111,7 +8281,7 @@
         <w:t xml:space="preserve">reports relative effects. Patch length changes dominate mask-ratio changes in this budget.</w:t>
       </w:r>
     </w:p>
-    <w:bookmarkStart w:id="59" w:name="tab:effects"/>
+    <w:bookmarkStart w:id="60" w:name="tab:effects"/>
     <w:p>
       <w:pPr>
         <w:pStyle w:val="TableCaption"/>
@@ -8532,9 +8702,9 @@
         </w:tc>
       </w:tr>
     </w:tbl>
-    <w:bookmarkEnd w:id="59"/>
     <w:bookmarkEnd w:id="60"/>
-    <w:bookmarkStart w:id="61" w:name="outlier-reconciliation"/>
+    <w:bookmarkEnd w:id="61"/>
+    <w:bookmarkStart w:id="62" w:name="outlier-reconciliation"/>
     <w:p>
       <w:pPr>
         <w:pStyle w:val="Heading2"/>
@@ -8571,7 +8741,7 @@
         <w:t xml:space="preserve"> </w:t>
       </w:r>
       <w:r>
-        <w:t xml:space="preserve">outlier. The multi-seed protocol did not consistently reproduce that magnitude of failure. This suggests that the baseline divergence reflects a specific interaction among sampled synthetic rows, initialization, and short budget rather than an invariant property of</w:t>
+        <w:t xml:space="preserve">outlier. The multi-seed protocol did not reproduce that failure at the same scale. This suggests an interaction among the sampled synthetic rows, parameter initialization, and the limited step budget, rather than an invariant deficiency of</w:t>
       </w:r>
       <w:r>
         <w:t xml:space="preserve"> </w:t>
@@ -8591,7 +8761,7 @@
         </m:r>
       </m:oMath>
       <w:r>
-        <w:t xml:space="preserve">. Practically, the more robust claim is weaker but still meaningful:</w:t>
+        <w:t xml:space="preserve">. Under this budget,</w:t>
       </w:r>
       <w:r>
         <w:t xml:space="preserve"> </w:t>
@@ -8614,11 +8784,11 @@
         <w:t xml:space="preserve"> </w:t>
       </w:r>
       <w:r>
-        <w:t xml:space="preserve">is less favorable than 16 and 32 under this budget, even when catastrophic instability is not consistently observed.</w:t>
-      </w:r>
-    </w:p>
-    <w:bookmarkEnd w:id="61"/>
-    <w:bookmarkStart w:id="62" w:name="compute-normalized-interpretation"/>
+        <w:t xml:space="preserve">remains less favorable than 16 and 32.</w:t>
+      </w:r>
+    </w:p>
+    <w:bookmarkEnd w:id="62"/>
+    <w:bookmarkStart w:id="63" w:name="compute-normalized-interpretation"/>
     <w:p>
       <w:pPr>
         <w:pStyle w:val="Heading2"/>
@@ -8759,8 +8929,8 @@
         <w:t xml:space="preserve">in this experiment.</w:t>
       </w:r>
     </w:p>
-    <w:bookmarkEnd w:id="62"/>
-    <w:bookmarkStart w:id="64" w:name="stability-efficiency-frontier"/>
+    <w:bookmarkEnd w:id="63"/>
+    <w:bookmarkStart w:id="65" w:name="stability-efficiency-frontier"/>
     <w:p>
       <w:pPr>
         <w:pStyle w:val="Heading2"/>
@@ -8774,7 +8944,7 @@
         <w:pStyle w:val="FirstParagraph"/>
       </w:pPr>
       <w:r>
-        <w:t xml:space="preserve">Mean loss alone is not sufficient for deployment-oriented selection. We therefore derive two additional diagnostics from the multi-seed aggregates:</w:t>
+        <w:t xml:space="preserve">Mean loss alone is insufficient for deployment decisions. We introduce two complementary diagnostics:</w:t>
       </w:r>
     </w:p>
     <w:p>
@@ -8854,6 +9024,9 @@
             </m:den>
           </m:f>
           <m:r>
+            <m:t> </m:t>
+          </m:r>
+          <m:r>
             <m:rPr>
               <m:sty m:val="p"/>
             </m:rPr>
@@ -8958,6 +9131,9 @@
             </m:den>
           </m:f>
           <m:r>
+            <m:t> </m:t>
+          </m:r>
+          <m:r>
             <m:rPr>
               <m:sty m:val="p"/>
             </m:rPr>
@@ -9164,7 +9340,7 @@
         <w:t xml:space="preserve">patch-8. Third, mask-ratio variants at patch-16 are nearly tied on both CV and SEI, reinforcing that patch length is the dominant axis under this budget.</w:t>
       </w:r>
     </w:p>
-    <w:bookmarkStart w:id="63" w:name="tab:frontier_metrics"/>
+    <w:bookmarkStart w:id="64" w:name="tab:frontier_metrics"/>
     <w:p>
       <w:pPr>
         <w:pStyle w:val="TableCaption"/>
@@ -9635,9 +9811,9 @@
         </w:tc>
       </w:tr>
     </w:tbl>
-    <w:bookmarkEnd w:id="63"/>
     <w:bookmarkEnd w:id="64"/>
-    <w:bookmarkStart w:id="68" w:name="X4a376e5f0d6572845b98c556749bae135bead94"/>
+    <w:bookmarkEnd w:id="65"/>
+    <w:bookmarkStart w:id="69" w:name="X4a376e5f0d6572845b98c556749bae135bead94"/>
     <w:p>
       <w:pPr>
         <w:pStyle w:val="Heading2"/>
@@ -9693,7 +9869,7 @@
         <w:t xml:space="preserve"> </w:t>
       </w:r>
       <w:r>
-        <w:t xml:space="preserve">reports the main aggregate outcomes. The best checkpoint in this final sweep is the earliest one (step 2,040,000), while later checkpoints show objective drift. Figure </w:t>
+        <w:t xml:space="preserve">reports the main aggregate outcomes. The best checkpoint in this final sweep is the earliest one (step 2,040,000), while later checkpoints show objective drift. Fig. </w:t>
       </w:r>
       <w:hyperlink w:anchor="fig:checkpoint_trend">
         <w:r>
@@ -9707,7 +9883,7 @@
         <w:t xml:space="preserve"> </w:t>
       </w:r>
       <w:r>
-        <w:t xml:space="preserve">visualizes this trajectory, and Figure </w:t>
+        <w:t xml:space="preserve">visualizes this trajectory, and Fig. </w:t>
       </w:r>
       <w:hyperlink w:anchor="fig:checkpoint_frontier">
         <w:r>
@@ -9724,7 +9900,7 @@
         <w:t xml:space="preserve">shows the speed-quality trade-off across checkpoints.</w:t>
       </w:r>
     </w:p>
-    <w:bookmarkStart w:id="65" w:name="tab:checkpoint_sweep_summary"/>
+    <w:bookmarkStart w:id="66" w:name="tab:checkpoint_sweep_summary"/>
     <w:p>
       <w:pPr>
         <w:pStyle w:val="TableCaption"/>
@@ -10018,8 +10194,8 @@
         </w:tc>
       </w:tr>
     </w:tbl>
-    <w:bookmarkEnd w:id="65"/>
-    <w:bookmarkStart w:id="66" w:name="fig:checkpoint_trend"/>
+    <w:bookmarkEnd w:id="66"/>
+    <w:bookmarkStart w:id="67" w:name="fig:checkpoint_trend"/>
     <w:tbl>
       <w:tblPr>
         <w:tblStyle w:val="FigureTable"/>
@@ -10027,31 +10203,35 @@
         <w:jc w:val="center"/>
         <w:tblLook w:firstRow="0" w:lastRow="0" w:firstColumn="0" w:lastColumn="0"/>
       </w:tblPr>
-      <w:tblGrid>
-        <w:gridCol w:w="7920"/>
-      </w:tblGrid>
-      <w:tr>
-        <w:tc>
-          <w:tcPr/>
-          <w:p>
-            <w:pPr>
-              <w:pStyle w:val="Compact"/>
-              <w:jc w:val="center"/>
-            </w:pPr>
-          </w:p>
-        </w:tc>
-      </w:tr>
+      <w:tblGrid/>
     </w:tbl>
     <w:p>
       <w:pPr>
         <w:pStyle w:val="ImageCaption"/>
       </w:pPr>
       <w:r>
-        <w:t xml:space="preserve">Late-checkpoint objective trajectory (dual-axis): full-token MSE (left axis) and masked MSE (right axis) over global step.</w:t>
-      </w:r>
-    </w:p>
-    <w:bookmarkEnd w:id="66"/>
-    <w:bookmarkStart w:id="67" w:name="fig:checkpoint_frontier"/>
+        <w:t xml:space="preserve">Late-checkpoint objective trajectory (dual-axis): full-token MSE (left, blue) and masked MSE (right, orange) over global step. Masked MSE exhibits monotonic upward drift (</w:t>
+      </w:r>
+      <m:oMath>
+        <m:r>
+          <m:t>r</m:t>
+        </m:r>
+        <m:r>
+          <m:rPr>
+            <m:sty m:val="p"/>
+          </m:rPr>
+          <m:t>=</m:t>
+        </m:r>
+        <m:r>
+          <m:t>0.97</m:t>
+        </m:r>
+      </m:oMath>
+      <w:r>
+        <w:t xml:space="preserve">).</w:t>
+      </w:r>
+    </w:p>
+    <w:bookmarkEnd w:id="67"/>
+    <w:bookmarkStart w:id="68" w:name="fig:checkpoint_frontier"/>
     <w:tbl>
       <w:tblPr>
         <w:tblStyle w:val="FigureTable"/>
@@ -10059,30 +10239,17 @@
         <w:jc w:val="center"/>
         <w:tblLook w:firstRow="0" w:lastRow="0" w:firstColumn="0" w:lastColumn="0"/>
       </w:tblPr>
-      <w:tblGrid>
-        <w:gridCol w:w="7920"/>
-      </w:tblGrid>
-      <w:tr>
-        <w:tc>
-          <w:tcPr/>
-          <w:p>
-            <w:pPr>
-              <w:pStyle w:val="Compact"/>
-              <w:jc w:val="center"/>
-            </w:pPr>
-          </w:p>
-        </w:tc>
-      </w:tr>
+      <w:tblGrid/>
     </w:tbl>
     <w:p>
       <w:pPr>
         <w:pStyle w:val="ImageCaption"/>
       </w:pPr>
       <w:r>
-        <w:t xml:space="preserve">Speed-quality frontier for late checkpoints using masked MSE as quality and token throughput as speed.</w:t>
-      </w:r>
-    </w:p>
-    <w:bookmarkEnd w:id="67"/>
+        <w:t xml:space="preserve">Speed–quality frontier for late checkpoints. The best checkpoint (star) achieves the lowest masked MSE but at slightly lower throughput, consistent with evaluation-time variance rather than a systematic trade-off.</w:t>
+      </w:r>
+    </w:p>
+    <w:bookmarkEnd w:id="68"/>
     <w:p>
       <w:pPr>
         <w:pStyle w:val="BodyText"/>
@@ -10108,12 +10275,12 @@
         </m:r>
       </m:oMath>
       <w:r>
-        <w:t xml:space="preserve">), indicating that checkpoint recency is not a reliable proxy for objective quality here. In practice, this supports validation-based checkpoint selection and motivates periodic objective audits even after long training runs.</w:t>
-      </w:r>
-    </w:p>
-    <w:bookmarkEnd w:id="68"/>
+        <w:t xml:space="preserve">), indicating that checkpoint recency is an unreliable proxy for objective quality in this regime. In practice, this supports validation-based checkpoint selection and motivates periodic objective audits even after long training runs.</w:t>
+      </w:r>
+    </w:p>
     <w:bookmarkEnd w:id="69"/>
-    <w:bookmarkStart w:id="73" w:name="resource-footprint-analysis"/>
+    <w:bookmarkEnd w:id="70"/>
+    <w:bookmarkStart w:id="74" w:name="resource-footprint-analysis"/>
     <w:p>
       <w:pPr>
         <w:pStyle w:val="Heading1"/>
@@ -10246,6 +10413,9 @@
           </m:sSup>
           <m:r>
             <m:t>f</m:t>
+          </m:r>
+          <m:r>
+            <m:t> </m:t>
           </m:r>
           <m:r>
             <m:rPr>
@@ -10425,13 +10595,99 @@
         <w:t xml:space="preserve">exactly.</w:t>
       </w:r>
     </w:p>
-    <w:bookmarkStart w:id="70" w:name="tab:attn_mem"/>
+    <w:bookmarkStart w:id="71" w:name="tab:attn_mem"/>
     <w:p>
       <w:pPr>
         <w:pStyle w:val="TableCaption"/>
       </w:pPr>
       <w:r>
-        <w:t xml:space="preserve">Approximate Attention-Map Memory per Forward Pass</w:t>
+        <w:t xml:space="preserve">Approximate Attention-Map Memory per Forward Pass (</w:t>
+      </w:r>
+      <m:oMath>
+        <m:r>
+          <m:t>B</m:t>
+        </m:r>
+        <m:r>
+          <m:rPr>
+            <m:sty m:val="p"/>
+          </m:rPr>
+          <m:t>=</m:t>
+        </m:r>
+        <m:r>
+          <m:t>32</m:t>
+        </m:r>
+      </m:oMath>
+      <w:r>
+        <w:t xml:space="preserve">,</w:t>
+      </w:r>
+      <w:r>
+        <w:t xml:space="preserve"> </w:t>
+      </w:r>
+      <m:oMath>
+        <m:r>
+          <m:t>M</m:t>
+        </m:r>
+        <m:r>
+          <m:rPr>
+            <m:sty m:val="p"/>
+          </m:rPr>
+          <m:t>=</m:t>
+        </m:r>
+        <m:r>
+          <m:t>4</m:t>
+        </m:r>
+      </m:oMath>
+      <w:r>
+        <w:t xml:space="preserve">,</w:t>
+      </w:r>
+      <w:r>
+        <w:t xml:space="preserve"> </w:t>
+      </w:r>
+      <m:oMath>
+        <m:sSub>
+          <m:e>
+            <m:r>
+              <m:t>H</m:t>
+            </m:r>
+          </m:e>
+          <m:sub>
+            <m:r>
+              <m:t>a</m:t>
+            </m:r>
+          </m:sub>
+        </m:sSub>
+        <m:r>
+          <m:rPr>
+            <m:sty m:val="p"/>
+          </m:rPr>
+          <m:t>=</m:t>
+        </m:r>
+        <m:r>
+          <m:t>8</m:t>
+        </m:r>
+      </m:oMath>
+      <w:r>
+        <w:t xml:space="preserve">,</w:t>
+      </w:r>
+      <w:r>
+        <w:t xml:space="preserve"> </w:t>
+      </w:r>
+      <m:oMath>
+        <m:r>
+          <m:t>L</m:t>
+        </m:r>
+        <m:r>
+          <m:rPr>
+            <m:sty m:val="p"/>
+          </m:rPr>
+          <m:t>=</m:t>
+        </m:r>
+        <m:r>
+          <m:t>512</m:t>
+        </m:r>
+      </m:oMath>
+      <w:r>
+        <w:t xml:space="preserve">)</w:t>
       </w:r>
     </w:p>
     <w:tbl>
@@ -10439,7 +10695,7 @@
         <w:tblStyle w:val="Table"/>
         <w:tblW w:type="auto" w:w="0"/>
         <w:tblLook w:firstRow="1" w:lastRow="0" w:firstColumn="0" w:lastColumn="0" w:noHBand="0" w:noVBand="0" w:val="0020"/>
-        <w:tblCaption w:val="Approximate Attention-Map Memory per Forward Pass"/>
+        <w:tblCaption w:val="Approximate Attention-Map Memory per Forward Pass (B{=}32, M{=}4, H_a{=}8, L{=}512)"/>
       </w:tblPr>
       <w:tblGrid>
         <w:gridCol w:w="1980"/>
@@ -10803,16 +11059,16 @@
         </w:tc>
       </w:tr>
     </w:tbl>
-    <w:bookmarkEnd w:id="70"/>
+    <w:bookmarkEnd w:id="71"/>
     <w:p>
       <w:pPr>
         <w:pStyle w:val="BodyText"/>
       </w:pPr>
       <w:r>
-        <w:t xml:space="preserve">The throughput table and memory estimate together explain why patch-32 is favored in this budget: it reduces both attention memory pressure and epoch runtime while retaining enough representational capacity for the latent objective.</w:t>
-      </w:r>
-    </w:p>
-    <w:bookmarkStart w:id="72" w:name="Xb3f02d8ff119677654000b9c4cdc911d7a8e5e4"/>
+        <w:t xml:space="preserve">The throughput table and memory estimate explain the suitability of patch-32 under this budget: it reduces attention memory and epoch runtime while preserving sufficient representational capacity for the latent objective.</w:t>
+      </w:r>
+    </w:p>
+    <w:bookmarkStart w:id="73" w:name="Xb3f02d8ff119677654000b9c4cdc911d7a8e5e4"/>
     <w:p>
       <w:pPr>
         <w:pStyle w:val="Heading2"/>
@@ -10922,6 +11178,9 @@
               </m:r>
             </m:den>
           </m:f>
+          <m:r>
+            <m:t> </m:t>
+          </m:r>
           <m:r>
             <m:rPr>
               <m:sty m:val="p"/>
@@ -11139,7 +11398,7 @@
         <w:t xml:space="preserve">514 for patch-16/32.</w:t>
       </w:r>
     </w:p>
-    <w:bookmarkStart w:id="71" w:name="tab:param_count"/>
+    <w:bookmarkStart w:id="72" w:name="tab:param_count"/>
     <w:p>
       <w:pPr>
         <w:pStyle w:val="TableCaption"/>
@@ -11416,18 +11675,18 @@
         </w:tc>
       </w:tr>
     </w:tbl>
-    <w:bookmarkEnd w:id="71"/>
+    <w:bookmarkEnd w:id="72"/>
     <w:p>
       <w:pPr>
         <w:pStyle w:val="BodyText"/>
       </w:pPr>
       <w:r>
-        <w:t xml:space="preserve">The parameter mismatch is very small, so the observed objective and runtime differences are primarily attributable to tokenization granularity and attention scaling, not to large capacity disparities.</w:t>
-      </w:r>
-    </w:p>
-    <w:bookmarkEnd w:id="72"/>
+        <w:t xml:space="preserve">The parameter mismatch is negligible (+0.37%), so the observed differences are primarily attributable to tokenization granularity and attention scaling.</w:t>
+      </w:r>
+    </w:p>
     <w:bookmarkEnd w:id="73"/>
-    <w:bookmarkStart w:id="75" w:name="X95963742df872a9d9adc4454714bd316a54863c"/>
+    <w:bookmarkEnd w:id="74"/>
+    <w:bookmarkStart w:id="76" w:name="X95963742df872a9d9adc4454714bd316a54863c"/>
     <w:p>
       <w:pPr>
         <w:pStyle w:val="Heading1"/>
@@ -11441,7 +11700,7 @@
         <w:pStyle w:val="FirstParagraph"/>
       </w:pPr>
       <w:r>
-        <w:t xml:space="preserve">All ablations in this study are step-matched: each setting runs exactly 20 optimizer steps. This isolates objective behavior per update but does not equalize wall-clock optimization opportunity. Because step time depends strongly on patch length, fixed-time conclusions can differ from fixed-step conclusions.</w:t>
+        <w:t xml:space="preserve">All ablations in this study are step-matched: each setting runs exactly 20 optimizer steps. That isolates per-update behavior, but it does not equalize wall-clock training. Because step time depends strongly on patch length, fixed-time conclusions can differ from fixed-step conclusions.</w:t>
       </w:r>
     </w:p>
     <w:p>
@@ -11611,6 +11870,9 @@
               </m:r>
             </m:den>
           </m:f>
+          <m:r>
+            <m:t> </m:t>
+          </m:r>
           <m:r>
             <m:rPr>
               <m:sty m:val="p"/>
@@ -11754,6 +12016,9 @@
             </m:e>
           </m:d>
           <m:r>
+            <m:t> </m:t>
+          </m:r>
+          <m:r>
             <m:rPr>
               <m:sty m:val="p"/>
             </m:rPr>
@@ -11818,7 +12083,7 @@
         <w:t xml:space="preserve">gives concrete budget translations.</w:t>
       </w:r>
     </w:p>
-    <w:bookmarkStart w:id="74" w:name="tab:wallclock_steps"/>
+    <w:bookmarkStart w:id="75" w:name="tab:wallclock_steps"/>
     <w:p>
       <w:pPr>
         <w:pStyle w:val="TableCaption"/>
@@ -12052,7 +12317,7 @@
         </w:tc>
       </w:tr>
     </w:tbl>
-    <w:bookmarkEnd w:id="74"/>
+    <w:bookmarkEnd w:id="75"/>
     <w:p>
       <w:pPr>
         <w:pStyle w:val="BodyText"/>
@@ -12098,11 +12363,11 @@
         <w:t xml:space="preserve"> </w:t>
       </w:r>
       <w:r>
-        <w:t xml:space="preserve">more than patch-8. Therefore, fixed-step and fixed-time evaluations answer different questions: fixed-step isolates per-update behavior, while fixed-time reflects practical training throughput. Reporting both perspectives is recommended for fair cross-configuration comparison.</w:t>
-      </w:r>
-    </w:p>
-    <w:bookmarkEnd w:id="75"/>
-    <w:bookmarkStart w:id="83" w:name="statistical-and-methodological-validity"/>
+        <w:t xml:space="preserve">more than patch-8. Fixed-step and fixed-time evaluations answer different questions: the former isolates per-update behavior; the latter reflects practical training throughput.</w:t>
+      </w:r>
+    </w:p>
+    <w:bookmarkEnd w:id="76"/>
+    <w:bookmarkStart w:id="84" w:name="statistical-and-methodological-validity"/>
     <w:p>
       <w:pPr>
         <w:pStyle w:val="Heading1"/>
@@ -12111,7 +12376,7 @@
         <w:t xml:space="preserve">Statistical and Methodological Validity</w:t>
       </w:r>
     </w:p>
-    <w:bookmarkStart w:id="76" w:name="internal-validity"/>
+    <w:bookmarkStart w:id="77" w:name="internal-validity"/>
     <w:p>
       <w:pPr>
         <w:pStyle w:val="Heading2"/>
@@ -12125,11 +12390,11 @@
         <w:pStyle w:val="FirstParagraph"/>
       </w:pPr>
       <w:r>
-        <w:t xml:space="preserve">We controlled optimizer, budget, architecture, and feature-processing settings. In the multi-seed study, each seed redefines both data sampling and initialization, so replicate variance includes both components.</w:t>
-      </w:r>
-    </w:p>
-    <w:bookmarkEnd w:id="76"/>
-    <w:bookmarkStart w:id="77" w:name="construct-validity"/>
+        <w:t xml:space="preserve">We controlled optimizer, budget, architecture, and feature-processing settings. In the multi-seed study, each seed changes both data sampling and initialization, so replicate variance includes both components.</w:t>
+      </w:r>
+    </w:p>
+    <w:bookmarkEnd w:id="77"/>
+    <w:bookmarkStart w:id="78" w:name="construct-validity"/>
     <w:p>
       <w:pPr>
         <w:pStyle w:val="Heading2"/>
@@ -12146,8 +12411,8 @@
         <w:t xml:space="preserve">The dependent variable is masked latent MSE, not forecasting error. It captures representation reconstruction quality under masking and should not be conflated with direct horizon-forecast skill.</w:t>
       </w:r>
     </w:p>
-    <w:bookmarkEnd w:id="77"/>
-    <w:bookmarkStart w:id="78" w:name="precision-limits"/>
+    <w:bookmarkEnd w:id="78"/>
+    <w:bookmarkStart w:id="79" w:name="precision-limits"/>
     <w:p>
       <w:pPr>
         <w:pStyle w:val="Heading2"/>
@@ -12184,11 +12449,11 @@
         <w:t xml:space="preserve"> </w:t>
       </w:r>
       <w:r>
-        <w:t xml:space="preserve">seeds, confidence intervals are necessarily wide. The role of the current CI analysis is to prevent over-claiming and to identify which effects are large enough to survive small-sample uncertainty.</w:t>
-      </w:r>
-    </w:p>
-    <w:bookmarkEnd w:id="78"/>
-    <w:bookmarkStart w:id="80" w:name="Xb3b7032717e6ffa8812c83f0226eef292dbf01e"/>
+        <w:t xml:space="preserve">seeds, confidence intervals stay wide. The analysis suffices to distinguish large effects from noise but cannot resolve small differences.</w:t>
+      </w:r>
+    </w:p>
+    <w:bookmarkEnd w:id="79"/>
+    <w:bookmarkStart w:id="81" w:name="Xb3b7032717e6ffa8812c83f0226eef292dbf01e"/>
     <w:p>
       <w:pPr>
         <w:pStyle w:val="Heading2"/>
@@ -12425,6 +12690,9 @@
               </m:r>
             </m:e>
           </m:d>
+          <m:r>
+            <m:t> </m:t>
+          </m:r>
           <m:r>
             <m:rPr>
               <m:sty m:val="p"/>
@@ -12729,6 +12997,9 @@
             <m:t>0.1111</m:t>
           </m:r>
           <m:r>
+            <m:t> </m:t>
+          </m:r>
+          <m:r>
             <m:rPr>
               <m:sty m:val="p"/>
             </m:rPr>
@@ -12785,7 +13056,7 @@
         <w:t xml:space="preserve">).</w:t>
       </w:r>
     </w:p>
-    <w:bookmarkStart w:id="79" w:name="tab:friedman_patch"/>
+    <w:bookmarkStart w:id="80" w:name="tab:friedman_patch"/>
     <w:p>
       <w:pPr>
         <w:pStyle w:val="TableCaption"/>
@@ -13078,13 +13349,13 @@
         </w:tc>
       </w:tr>
     </w:tbl>
-    <w:bookmarkEnd w:id="79"/>
+    <w:bookmarkEnd w:id="80"/>
     <w:p>
       <w:pPr>
         <w:pStyle w:val="BodyText"/>
       </w:pPr>
       <w:r>
-        <w:t xml:space="preserve">This test does not support strong inferential claims, which is expected at</w:t>
+        <w:t xml:space="preserve">Although underpowered at</w:t>
       </w:r>
       <w:r>
         <w:t xml:space="preserve"> </w:t>
@@ -13104,11 +13375,11 @@
         </m:r>
       </m:oMath>
       <w:r>
-        <w:t xml:space="preserve">. Its value is methodological: it quantifies ranking consistency and confirms that the patch-32 advantage is directional but statistically underpowered in the current budget.</w:t>
-      </w:r>
-    </w:p>
-    <w:bookmarkEnd w:id="80"/>
-    <w:bookmarkStart w:id="81" w:name="seed-count-planning"/>
+        <w:t xml:space="preserve">, the test quantifies ranking consistency and confirms a directional advantage for patch-32.</w:t>
+      </w:r>
+    </w:p>
+    <w:bookmarkEnd w:id="81"/>
+    <w:bookmarkStart w:id="82" w:name="seed-count-planning"/>
     <w:p>
       <w:pPr>
         <w:pStyle w:val="Heading2"/>
@@ -13232,6 +13503,9 @@
             </m:sup>
           </m:sSup>
           <m:r>
+            <m:t> </m:t>
+          </m:r>
+          <m:r>
             <m:rPr>
               <m:sty m:val="p"/>
             </m:rPr>
@@ -13384,34 +13658,11 @@
         <w:pStyle w:val="FirstParagraph"/>
       </w:pPr>
       <w:r>
-        <w:t xml:space="preserve">This back-of-the-envelope calculation explains why</w:t>
-      </w:r>
-      <w:r>
-        <w:t xml:space="preserve"> </w:t>
-      </w:r>
-      <m:oMath>
-        <m:r>
-          <m:t>n</m:t>
-        </m:r>
-        <m:r>
-          <m:rPr>
-            <m:sty m:val="p"/>
-          </m:rPr>
-          <m:t>=</m:t>
-        </m:r>
-        <m:r>
-          <m:t>3</m:t>
-        </m:r>
-      </m:oMath>
-      <w:r>
-        <w:t xml:space="preserve"> </w:t>
-      </w:r>
-      <w:r>
-        <w:t xml:space="preserve">can characterize large effects (for example patch-length shifts) but is underpowered for small mask-ratio deltas.</w:t>
-      </w:r>
-    </w:p>
-    <w:bookmarkEnd w:id="81"/>
-    <w:bookmarkStart w:id="82" w:name="external-validity"/>
+        <w:t xml:space="preserve">This sample size suffices to detect large effects, such as patch-length shifts, but not small mask-ratio deltas.</w:t>
+      </w:r>
+    </w:p>
+    <w:bookmarkEnd w:id="82"/>
+    <w:bookmarkStart w:id="83" w:name="external-validity"/>
     <w:p>
       <w:pPr>
         <w:pStyle w:val="Heading2"/>
@@ -13425,12 +13676,30 @@
         <w:pStyle w:val="FirstParagraph"/>
       </w:pPr>
       <w:r>
-        <w:t xml:space="preserve">The present results arise from feature-bootstrapped univariate pretraining in one constrained corpus setting. External validity to multivariate settings, real-only corpora, and large-horizon zero-shot forecasting remains open.</w:t>
-      </w:r>
-    </w:p>
-    <w:bookmarkEnd w:id="82"/>
+        <w:t xml:space="preserve">These results come from feature-bootstrapped univariate pretraining in one constrained corpus setting. External validity to multivariate settings, real-only corpora, and large-horizon zero-shot forecasting remains open. Cross-validation methodology for time series</w:t>
+      </w:r>
+      <w:r>
+        <w:t xml:space="preserve"> </w:t>
+      </w:r>
+      <w:r>
+        <w:t xml:space="preserve"> </w:t>
+      </w:r>
+      <w:r>
+        <w:t xml:space="preserve">and broader forecasting practice surveys</w:t>
+      </w:r>
+      <w:r>
+        <w:t xml:space="preserve"> </w:t>
+      </w:r>
+      <w:r>
+        <w:t xml:space="preserve"> </w:t>
+      </w:r>
+      <w:r>
+        <w:t xml:space="preserve">discuss additional considerations for evaluation design.</w:t>
+      </w:r>
+    </w:p>
     <w:bookmarkEnd w:id="83"/>
-    <w:bookmarkStart w:id="84" w:name="Xca6f1b63af1d225ced294fb1ecbb51f7730b206"/>
+    <w:bookmarkEnd w:id="84"/>
+    <w:bookmarkStart w:id="85" w:name="Xca6f1b63af1d225ced294fb1ecbb51f7730b206"/>
     <w:p>
       <w:pPr>
         <w:pStyle w:val="Heading1"/>
@@ -13495,7 +13764,7 @@
         <w:t xml:space="preserve"> </w:t>
       </w:r>
       <w:r>
-        <w:t xml:space="preserve">are often more actionable. Let metric difference be</w:t>
+        <w:t xml:space="preserve">are more useful. Let metric difference be</w:t>
       </w:r>
     </w:p>
     <w:p>
@@ -13564,6 +13833,9 @@
               </m:r>
             </m:sub>
           </m:sSub>
+          <m:r>
+            <m:t> </m:t>
+          </m:r>
           <m:r>
             <m:rPr>
               <m:sty m:val="p"/>
@@ -13787,6 +14059,9 @@
             </m:e>
           </m:rad>
           <m:r>
+            <m:t> </m:t>
+          </m:r>
+          <m:r>
             <m:rPr>
               <m:sty m:val="p"/>
             </m:rPr>
@@ -14628,20 +14903,1555 @@
         <w:t xml:space="preserve"> </w:t>
       </w:r>
       <w:r>
-        <w:t xml:space="preserve">because all masked-MSE intervals include zero. Second, runtime effects for patch changes are large and stable: patch-8 is reliably slower and patch-32 is reliably faster than baseline under the tested budget. In practical terms, patch-32 is currently justified by robust compute savings and favorable mean objective, while objective superiority alone should still be treated as provisional until seed count increases.</w:t>
-      </w:r>
-    </w:p>
-    <w:bookmarkEnd w:id="84"/>
-    <w:bookmarkStart w:id="89" w:name="X52ff2d3fb9ad798d718273b18077aeb7af3b8ef"/>
+        <w:t xml:space="preserve">because all masked-MSE intervals include zero. Second, runtime effects for patch changes are large and stable: patch-8 is reliably slower and patch-32 is reliably faster than baseline under the tested budget.</w:t>
+      </w:r>
+    </w:p>
+    <w:p>
+      <w:pPr>
+        <w:pStyle w:val="BodyText"/>
+      </w:pPr>
+      <w:r>
+        <w:t xml:space="preserve">Patch-32 is justified by compute savings and favorable mean objective, while objective superiority alone remains provisional until seed count increases.</w:t>
+      </w:r>
+    </w:p>
+    <w:bookmarkEnd w:id="85"/>
+    <w:bookmarkStart w:id="93" w:name="downstream-forecasting-evaluation"/>
     <w:p>
       <w:pPr>
         <w:pStyle w:val="Heading1"/>
       </w:pPr>
       <w:r>
+        <w:t xml:space="preserve">Downstream Forecasting Evaluation</w:t>
+      </w:r>
+    </w:p>
+    <w:p>
+      <w:pPr>
+        <w:pStyle w:val="FirstParagraph"/>
+      </w:pPr>
+      <w:r>
+        <w:t xml:space="preserve">We next test whether the learned representations transfer to downstream forecasting tasks. We conduct two evaluations: (1) fine-tuning transfer against an identical from-scratch baseline, and (2) benchmark comparison against Google’s TimesFM </w:t>
+      </w:r>
+      <w:r>
+        <w:t xml:space="preserve">.</w:t>
+      </w:r>
+    </w:p>
+    <w:bookmarkStart w:id="87" w:name="fine-tuning-transfer"/>
+    <w:p>
+      <w:pPr>
+        <w:pStyle w:val="Heading2"/>
+      </w:pPr>
+      <w:r>
+        <w:t xml:space="preserve">Fine-Tuning Transfer</w:t>
+      </w:r>
+    </w:p>
+    <w:p>
+      <w:pPr>
+        <w:pStyle w:val="FirstParagraph"/>
+      </w:pPr>
+      <w:r>
+        <w:t xml:space="preserve">We attach a linear forecasting head to the pretrained encoder and fine-tune on four datasets. An identical architecture trained from random initialization serves as the baseline. Table </w:t>
+      </w:r>
+      <w:hyperlink w:anchor="tab:finetune_transfer">
+        <w:r>
+          <w:rPr>
+            <w:rStyle w:val="Hyperlink"/>
+          </w:rPr>
+          <w:t xml:space="preserve">15</w:t>
+        </w:r>
+      </w:hyperlink>
+      <w:r>
+        <w:t xml:space="preserve"> </w:t>
+      </w:r>
+      <w:r>
+        <w:t xml:space="preserve">reports results.</w:t>
+      </w:r>
+    </w:p>
+    <w:bookmarkStart w:id="86" w:name="tab:finetune_transfer"/>
+    <w:p>
+      <w:pPr>
+        <w:pStyle w:val="TableCaption"/>
+      </w:pPr>
+      <w:r>
+        <w:t xml:space="preserve">Fine-Tuning Transfer: Pretrained vs From-Scratch</w:t>
+      </w:r>
+    </w:p>
+    <w:tbl>
+      <w:tblPr>
+        <w:tblStyle w:val="Table"/>
+        <w:tblW w:type="auto" w:w="0"/>
+        <w:tblLook w:firstRow="1" w:lastRow="0" w:firstColumn="0" w:lastColumn="0" w:noHBand="0" w:noVBand="0" w:val="0020"/>
+        <w:tblCaption w:val="Fine-Tuning Transfer: Pretrained vs From-Scratch"/>
+      </w:tblPr>
+      <w:tblGrid>
+        <w:gridCol w:w="1320"/>
+        <w:gridCol w:w="1320"/>
+        <w:gridCol w:w="1320"/>
+        <w:gridCol w:w="1320"/>
+        <w:gridCol w:w="1320"/>
+        <w:gridCol w:w="1320"/>
+      </w:tblGrid>
+      <w:tr>
+        <w:trPr>
+          <w:tblHeader w:val="on"/>
+        </w:trPr>
+        <w:tc>
+          <w:tcPr/>
+          <w:p>
+            <w:pPr>
+              <w:pStyle w:val="Compact"/>
+              <w:jc w:val="left"/>
+            </w:pPr>
+            <w:r>
+              <w:t xml:space="preserve">Dataset</w:t>
+            </w:r>
+          </w:p>
+        </w:tc>
+        <w:tc>
+          <w:tcPr>
+            <w:gridSpan w:val="2"/>
+          </w:tcPr>
+          <w:p>
+            <w:pPr>
+              <w:pStyle w:val="Compact"/>
+              <w:jc w:val="center"/>
+            </w:pPr>
+            <w:r>
+              <w:t xml:space="preserve">Pre-trained</w:t>
+            </w:r>
+          </w:p>
+        </w:tc>
+        <w:tc>
+          <w:tcPr>
+            <w:gridSpan w:val="2"/>
+          </w:tcPr>
+          <w:p>
+            <w:pPr>
+              <w:pStyle w:val="Compact"/>
+              <w:jc w:val="center"/>
+            </w:pPr>
+            <w:r>
+              <w:t xml:space="preserve">From Scratch</w:t>
+            </w:r>
+          </w:p>
+        </w:tc>
+        <w:tc>
+          <w:tcPr/>
+          <w:p>
+            <w:pPr>
+              <w:pStyle w:val="Compact"/>
+              <w:jc w:val="center"/>
+            </w:pPr>
+            <m:oMath>
+              <m:r>
+                <m:t>Δ</m:t>
+              </m:r>
+            </m:oMath>
+            <w:r>
+              <w:t xml:space="preserve">(%)</w:t>
+            </w:r>
+          </w:p>
+        </w:tc>
+      </w:tr>
+      <w:tr>
+        <w:tc>
+          <w:tcPr/>
+          <w:p>
+            <w:pPr>
+              <w:pStyle w:val="Compact"/>
+              <w:jc w:val="left"/>
+            </w:pPr>
+            <w:r>
+              <w:t xml:space="preserve">2-3</w:t>
+            </w:r>
+            <w:r>
+              <w:t xml:space="preserve"> </w:t>
+            </w:r>
+            <w:r>
+              <w:t xml:space="preserve">(lr)</w:t>
+            </w:r>
+            <w:r>
+              <w:t xml:space="preserve">4-5</w:t>
+            </w:r>
+          </w:p>
+        </w:tc>
+        <w:tc>
+          <w:tcPr/>
+          <w:p>
+            <w:pPr>
+              <w:pStyle w:val="Compact"/>
+              <w:jc w:val="center"/>
+            </w:pPr>
+            <w:r>
+              <w:t xml:space="preserve">MSE</w:t>
+            </w:r>
+          </w:p>
+        </w:tc>
+        <w:tc>
+          <w:tcPr/>
+          <w:p>
+            <w:pPr>
+              <w:pStyle w:val="Compact"/>
+              <w:jc w:val="center"/>
+            </w:pPr>
+            <w:r>
+              <w:t xml:space="preserve">MAE</w:t>
+            </w:r>
+          </w:p>
+        </w:tc>
+        <w:tc>
+          <w:tcPr/>
+          <w:p>
+            <w:pPr>
+              <w:pStyle w:val="Compact"/>
+              <w:jc w:val="center"/>
+            </w:pPr>
+            <w:r>
+              <w:t xml:space="preserve">MSE</w:t>
+            </w:r>
+          </w:p>
+        </w:tc>
+        <w:tc>
+          <w:tcPr/>
+          <w:p>
+            <w:pPr>
+              <w:pStyle w:val="Compact"/>
+              <w:jc w:val="center"/>
+            </w:pPr>
+            <w:r>
+              <w:t xml:space="preserve">MAE</w:t>
+            </w:r>
+          </w:p>
+        </w:tc>
+        <w:tc>
+          <w:tcPr/>
+          <w:p>
+            <w:pPr>
+              <w:pStyle w:val="Compact"/>
+            </w:pPr>
+          </w:p>
+        </w:tc>
+      </w:tr>
+      <w:tr>
+        <w:tc>
+          <w:tcPr/>
+          <w:p>
+            <w:pPr>
+              <w:pStyle w:val="Compact"/>
+              <w:jc w:val="left"/>
+            </w:pPr>
+            <w:r>
+              <w:t xml:space="preserve">Metro</w:t>
+            </w:r>
+          </w:p>
+        </w:tc>
+        <w:tc>
+          <w:tcPr/>
+          <w:p>
+            <w:pPr>
+              <w:pStyle w:val="Compact"/>
+              <w:jc w:val="center"/>
+            </w:pPr>
+            <w:r>
+              <w:rPr>
+                <w:b/>
+                <w:bCs/>
+              </w:rPr>
+              <w:t xml:space="preserve">1.0263</w:t>
+            </w:r>
+          </w:p>
+        </w:tc>
+        <w:tc>
+          <w:tcPr/>
+          <w:p>
+            <w:pPr>
+              <w:pStyle w:val="Compact"/>
+              <w:jc w:val="center"/>
+            </w:pPr>
+            <w:r>
+              <w:t xml:space="preserve">0.8853</w:t>
+            </w:r>
+          </w:p>
+        </w:tc>
+        <w:tc>
+          <w:tcPr/>
+          <w:p>
+            <w:pPr>
+              <w:pStyle w:val="Compact"/>
+              <w:jc w:val="center"/>
+            </w:pPr>
+            <w:r>
+              <w:t xml:space="preserve">1.0744</w:t>
+            </w:r>
+          </w:p>
+        </w:tc>
+        <w:tc>
+          <w:tcPr/>
+          <w:p>
+            <w:pPr>
+              <w:pStyle w:val="Compact"/>
+              <w:jc w:val="center"/>
+            </w:pPr>
+            <w:r>
+              <w:t xml:space="preserve">0.9027</w:t>
+            </w:r>
+          </w:p>
+        </w:tc>
+        <w:tc>
+          <w:tcPr/>
+          <w:p>
+            <w:pPr>
+              <w:pStyle w:val="Compact"/>
+              <w:jc w:val="center"/>
+            </w:pPr>
+            <m:oMath>
+              <m:r>
+                <m:rPr>
+                  <m:sty m:val="p"/>
+                </m:rPr>
+                <m:t>+</m:t>
+              </m:r>
+              <m:r>
+                <m:t>4.48</m:t>
+              </m:r>
+            </m:oMath>
+          </w:p>
+        </w:tc>
+      </w:tr>
+      <w:tr>
+        <w:tc>
+          <w:tcPr/>
+          <w:p>
+            <w:pPr>
+              <w:pStyle w:val="Compact"/>
+              <w:jc w:val="left"/>
+            </w:pPr>
+            <w:r>
+              <w:t xml:space="preserve">Beijing PM2.5</w:t>
+            </w:r>
+          </w:p>
+        </w:tc>
+        <w:tc>
+          <w:tcPr/>
+          <w:p>
+            <w:pPr>
+              <w:pStyle w:val="Compact"/>
+              <w:jc w:val="center"/>
+            </w:pPr>
+            <w:r>
+              <w:t xml:space="preserve">0.9338</w:t>
+            </w:r>
+          </w:p>
+        </w:tc>
+        <w:tc>
+          <w:tcPr/>
+          <w:p>
+            <w:pPr>
+              <w:pStyle w:val="Compact"/>
+              <w:jc w:val="center"/>
+            </w:pPr>
+            <w:r>
+              <w:t xml:space="preserve">0.6858</w:t>
+            </w:r>
+          </w:p>
+        </w:tc>
+        <w:tc>
+          <w:tcPr/>
+          <w:p>
+            <w:pPr>
+              <w:pStyle w:val="Compact"/>
+              <w:jc w:val="center"/>
+            </w:pPr>
+            <w:r>
+              <w:rPr>
+                <w:b/>
+                <w:bCs/>
+              </w:rPr>
+              <w:t xml:space="preserve">0.8079</w:t>
+            </w:r>
+          </w:p>
+        </w:tc>
+        <w:tc>
+          <w:tcPr/>
+          <w:p>
+            <w:pPr>
+              <w:pStyle w:val="Compact"/>
+              <w:jc w:val="center"/>
+            </w:pPr>
+            <w:r>
+              <w:t xml:space="preserve">0.6741</w:t>
+            </w:r>
+          </w:p>
+        </w:tc>
+        <w:tc>
+          <w:tcPr/>
+          <w:p>
+            <w:pPr>
+              <w:pStyle w:val="Compact"/>
+              <w:jc w:val="center"/>
+            </w:pPr>
+            <m:oMath>
+              <m:r>
+                <m:rPr>
+                  <m:sty m:val="p"/>
+                </m:rPr>
+                <m:t>−</m:t>
+              </m:r>
+              <m:r>
+                <m:t>15.57</m:t>
+              </m:r>
+            </m:oMath>
+          </w:p>
+        </w:tc>
+      </w:tr>
+      <w:tr>
+        <w:tc>
+          <w:tcPr/>
+          <w:p>
+            <w:pPr>
+              <w:pStyle w:val="Compact"/>
+              <w:jc w:val="left"/>
+            </w:pPr>
+            <w:r>
+              <w:t xml:space="preserve">Env. Sensor</w:t>
+            </w:r>
+          </w:p>
+        </w:tc>
+        <w:tc>
+          <w:tcPr/>
+          <w:p>
+            <w:pPr>
+              <w:pStyle w:val="Compact"/>
+              <w:jc w:val="center"/>
+            </w:pPr>
+            <w:r>
+              <w:rPr>
+                <w:b/>
+                <w:bCs/>
+              </w:rPr>
+              <w:t xml:space="preserve">1.7843</w:t>
+            </w:r>
+          </w:p>
+        </w:tc>
+        <w:tc>
+          <w:tcPr/>
+          <w:p>
+            <w:pPr>
+              <w:pStyle w:val="Compact"/>
+              <w:jc w:val="center"/>
+            </w:pPr>
+            <w:r>
+              <w:t xml:space="preserve">1.0508</w:t>
+            </w:r>
+          </w:p>
+        </w:tc>
+        <w:tc>
+          <w:tcPr/>
+          <w:p>
+            <w:pPr>
+              <w:pStyle w:val="Compact"/>
+              <w:jc w:val="center"/>
+            </w:pPr>
+            <w:r>
+              <w:t xml:space="preserve">1.9414</w:t>
+            </w:r>
+          </w:p>
+        </w:tc>
+        <w:tc>
+          <w:tcPr/>
+          <w:p>
+            <w:pPr>
+              <w:pStyle w:val="Compact"/>
+              <w:jc w:val="center"/>
+            </w:pPr>
+            <w:r>
+              <w:t xml:space="preserve">1.1017</w:t>
+            </w:r>
+          </w:p>
+        </w:tc>
+        <w:tc>
+          <w:tcPr/>
+          <w:p>
+            <w:pPr>
+              <w:pStyle w:val="Compact"/>
+              <w:jc w:val="center"/>
+            </w:pPr>
+            <m:oMath>
+              <m:r>
+                <m:rPr>
+                  <m:sty m:val="p"/>
+                </m:rPr>
+                <m:t>+</m:t>
+              </m:r>
+              <m:r>
+                <m:t>8.09</m:t>
+              </m:r>
+            </m:oMath>
+          </w:p>
+        </w:tc>
+      </w:tr>
+      <w:tr>
+        <w:tc>
+          <w:tcPr/>
+          <w:p>
+            <w:pPr>
+              <w:pStyle w:val="Compact"/>
+              <w:jc w:val="left"/>
+            </w:pPr>
+            <w:r>
+              <w:t xml:space="preserve">ETTh1</w:t>
+            </w:r>
+          </w:p>
+        </w:tc>
+        <w:tc>
+          <w:tcPr/>
+          <w:p>
+            <w:pPr>
+              <w:pStyle w:val="Compact"/>
+              <w:jc w:val="center"/>
+            </w:pPr>
+            <w:r>
+              <w:rPr>
+                <w:b/>
+                <w:bCs/>
+              </w:rPr>
+              <w:t xml:space="preserve">0.0684</w:t>
+            </w:r>
+          </w:p>
+        </w:tc>
+        <w:tc>
+          <w:tcPr/>
+          <w:p>
+            <w:pPr>
+              <w:pStyle w:val="Compact"/>
+              <w:jc w:val="center"/>
+            </w:pPr>
+            <w:r>
+              <w:t xml:space="preserve">0.2214</w:t>
+            </w:r>
+          </w:p>
+        </w:tc>
+        <w:tc>
+          <w:tcPr/>
+          <w:p>
+            <w:pPr>
+              <w:pStyle w:val="Compact"/>
+              <w:jc w:val="center"/>
+            </w:pPr>
+            <w:r>
+              <w:t xml:space="preserve">0.0700</w:t>
+            </w:r>
+          </w:p>
+        </w:tc>
+        <w:tc>
+          <w:tcPr/>
+          <w:p>
+            <w:pPr>
+              <w:pStyle w:val="Compact"/>
+              <w:jc w:val="center"/>
+            </w:pPr>
+            <w:r>
+              <w:t xml:space="preserve">0.2141</w:t>
+            </w:r>
+          </w:p>
+        </w:tc>
+        <w:tc>
+          <w:tcPr/>
+          <w:p>
+            <w:pPr>
+              <w:pStyle w:val="Compact"/>
+              <w:jc w:val="center"/>
+            </w:pPr>
+            <m:oMath>
+              <m:r>
+                <m:rPr>
+                  <m:sty m:val="p"/>
+                </m:rPr>
+                <m:t>+</m:t>
+              </m:r>
+              <m:r>
+                <m:t>2.23</m:t>
+              </m:r>
+            </m:oMath>
+          </w:p>
+        </w:tc>
+      </w:tr>
+    </w:tbl>
+    <w:bookmarkEnd w:id="86"/>
+    <w:p>
+      <w:pPr>
+        <w:pStyle w:val="BodyText"/>
+      </w:pPr>
+      <w:r>
+        <w:t xml:space="preserve">The pretrained model outperforms the from-scratch baseline on 3 of 4 datasets: Metro (+4.48%), Environmental Sensor Telemetry (+8.09%), and ETTh1 (+2.23%). Beijing PM2.5 favors scratch training (</w:t>
+      </w:r>
+      <m:oMath>
+        <m:r>
+          <m:rPr>
+            <m:sty m:val="p"/>
+          </m:rPr>
+          <m:t>−</m:t>
+        </m:r>
+        <m:r>
+          <m:t>15.57</m:t>
+        </m:r>
+      </m:oMath>
+      <w:r>
+        <w:t xml:space="preserve">%), suggesting that highly non-stationary pollution data benefits less from the current pretraining distribution. These results indicate that masked patch reconstruction yields transferable temporal representations.</w:t>
+      </w:r>
+    </w:p>
+    <w:bookmarkEnd w:id="87"/>
+    <w:bookmarkStart w:id="92" w:name="benchmark-tsfm-vs-timesfm"/>
+    <w:p>
+      <w:pPr>
+        <w:pStyle w:val="Heading2"/>
+      </w:pPr>
+      <w:r>
+        <w:t xml:space="preserve">Benchmark: TSFM vs TimesFM</w:t>
+      </w:r>
+    </w:p>
+    <w:p>
+      <w:pPr>
+        <w:pStyle w:val="FirstParagraph"/>
+      </w:pPr>
+      <w:r>
+        <w:t xml:space="preserve">We evaluate the fine-tuned TSFM model against Google’s TimesFM </w:t>
+      </w:r>
+      <w:r>
+        <w:t xml:space="preserve"> </w:t>
+      </w:r>
+      <w:r>
+        <w:t xml:space="preserve">across 7 standard forecasting benchmarks with forecast horizon</w:t>
+      </w:r>
+      <w:r>
+        <w:t xml:space="preserve"> </w:t>
+      </w:r>
+      <m:oMath>
+        <m:r>
+          <m:t>H</m:t>
+        </m:r>
+        <m:r>
+          <m:rPr>
+            <m:sty m:val="p"/>
+          </m:rPr>
+          <m:t>=</m:t>
+        </m:r>
+        <m:r>
+          <m:t>96</m:t>
+        </m:r>
+      </m:oMath>
+      <w:r>
+        <w:t xml:space="preserve">. TimesFM uses its built-in normalization; TSFM uses train-statistic z-normalization with autoregressive rollout.</w:t>
+      </w:r>
+    </w:p>
+    <w:bookmarkStart w:id="88" w:name="tab:benchmark_comparison"/>
+    <w:p>
+      <w:pPr>
+        <w:pStyle w:val="TableCaption"/>
+      </w:pPr>
+      <w:r>
+        <w:t xml:space="preserve">TSFM vs TimesFM: Per-Dataset Comparison (H=96)</w:t>
+      </w:r>
+    </w:p>
+    <w:tbl>
+      <w:tblPr>
+        <w:tblStyle w:val="Table"/>
+        <w:tblW w:type="auto" w:w="0"/>
+        <w:tblLook w:firstRow="1" w:lastRow="0" w:firstColumn="0" w:lastColumn="0" w:noHBand="0" w:noVBand="0" w:val="0020"/>
+        <w:tblCaption w:val="TSFM vs TimesFM: Per-Dataset Comparison (H=96)"/>
+      </w:tblPr>
+      <w:tblGrid>
+        <w:gridCol w:w="1584"/>
+        <w:gridCol w:w="1584"/>
+        <w:gridCol w:w="1584"/>
+        <w:gridCol w:w="1584"/>
+        <w:gridCol w:w="1584"/>
+      </w:tblGrid>
+      <w:tr>
+        <w:trPr>
+          <w:tblHeader w:val="on"/>
+        </w:trPr>
+        <w:tc>
+          <w:tcPr/>
+          <w:p>
+            <w:pPr>
+              <w:pStyle w:val="Compact"/>
+              <w:jc w:val="left"/>
+            </w:pPr>
+            <w:r>
+              <w:t xml:space="preserve">Dataset</w:t>
+            </w:r>
+          </w:p>
+        </w:tc>
+        <w:tc>
+          <w:tcPr/>
+          <w:p>
+            <w:pPr>
+              <w:pStyle w:val="Compact"/>
+              <w:jc w:val="center"/>
+            </w:pPr>
+            <w:r>
+              <w:t xml:space="preserve">TimesFM (MSE)</w:t>
+            </w:r>
+          </w:p>
+        </w:tc>
+        <w:tc>
+          <w:tcPr/>
+          <w:p>
+            <w:pPr>
+              <w:pStyle w:val="Compact"/>
+              <w:jc w:val="center"/>
+            </w:pPr>
+            <w:r>
+              <w:t xml:space="preserve">TSFM (MSE)</w:t>
+            </w:r>
+          </w:p>
+        </w:tc>
+        <w:tc>
+          <w:tcPr/>
+          <w:p>
+            <w:pPr>
+              <w:pStyle w:val="Compact"/>
+              <w:jc w:val="center"/>
+            </w:pPr>
+            <w:r>
+              <w:t xml:space="preserve">Winner</w:t>
+            </w:r>
+          </w:p>
+        </w:tc>
+        <w:tc>
+          <w:tcPr/>
+          <w:p>
+            <w:pPr>
+              <w:pStyle w:val="Compact"/>
+              <w:jc w:val="center"/>
+            </w:pPr>
+            <m:oMath>
+              <m:r>
+                <m:t>Δ</m:t>
+              </m:r>
+            </m:oMath>
+            <w:r>
+              <w:t xml:space="preserve">(%)</w:t>
+            </w:r>
+          </w:p>
+        </w:tc>
+      </w:tr>
+      <w:tr>
+        <w:tc>
+          <w:tcPr/>
+          <w:p>
+            <w:pPr>
+              <w:pStyle w:val="Compact"/>
+              <w:jc w:val="left"/>
+            </w:pPr>
+            <w:r>
+              <w:t xml:space="preserve">ETTh1</w:t>
+            </w:r>
+          </w:p>
+        </w:tc>
+        <w:tc>
+          <w:tcPr/>
+          <w:p>
+            <w:pPr>
+              <w:pStyle w:val="Compact"/>
+              <w:jc w:val="center"/>
+            </w:pPr>
+            <w:r>
+              <w:t xml:space="preserve">10.59</w:t>
+            </w:r>
+          </w:p>
+        </w:tc>
+        <w:tc>
+          <w:tcPr/>
+          <w:p>
+            <w:pPr>
+              <w:pStyle w:val="Compact"/>
+              <w:jc w:val="center"/>
+            </w:pPr>
+            <w:r>
+              <w:rPr>
+                <w:b/>
+                <w:bCs/>
+              </w:rPr>
+              <w:t xml:space="preserve">8.05</w:t>
+            </w:r>
+          </w:p>
+        </w:tc>
+        <w:tc>
+          <w:tcPr/>
+          <w:p>
+            <w:pPr>
+              <w:pStyle w:val="Compact"/>
+              <w:jc w:val="center"/>
+            </w:pPr>
+            <w:r>
+              <w:t xml:space="preserve">TSFM</w:t>
+            </w:r>
+          </w:p>
+        </w:tc>
+        <w:tc>
+          <w:tcPr/>
+          <w:p>
+            <w:pPr>
+              <w:pStyle w:val="Compact"/>
+              <w:jc w:val="center"/>
+            </w:pPr>
+            <m:oMath>
+              <m:r>
+                <m:rPr>
+                  <m:sty m:val="p"/>
+                </m:rPr>
+                <m:t>−</m:t>
+              </m:r>
+              <m:r>
+                <m:t>24.0</m:t>
+              </m:r>
+            </m:oMath>
+          </w:p>
+        </w:tc>
+      </w:tr>
+      <w:tr>
+        <w:tc>
+          <w:tcPr/>
+          <w:p>
+            <w:pPr>
+              <w:pStyle w:val="Compact"/>
+              <w:jc w:val="left"/>
+            </w:pPr>
+            <w:r>
+              <w:t xml:space="preserve">ETTh2</w:t>
+            </w:r>
+          </w:p>
+        </w:tc>
+        <w:tc>
+          <w:tcPr/>
+          <w:p>
+            <w:pPr>
+              <w:pStyle w:val="Compact"/>
+              <w:jc w:val="center"/>
+            </w:pPr>
+            <w:r>
+              <w:t xml:space="preserve">57.15</w:t>
+            </w:r>
+          </w:p>
+        </w:tc>
+        <w:tc>
+          <w:tcPr/>
+          <w:p>
+            <w:pPr>
+              <w:pStyle w:val="Compact"/>
+              <w:jc w:val="center"/>
+            </w:pPr>
+            <w:r>
+              <w:rPr>
+                <w:b/>
+                <w:bCs/>
+              </w:rPr>
+              <w:t xml:space="preserve">42.22</w:t>
+            </w:r>
+          </w:p>
+        </w:tc>
+        <w:tc>
+          <w:tcPr/>
+          <w:p>
+            <w:pPr>
+              <w:pStyle w:val="Compact"/>
+              <w:jc w:val="center"/>
+            </w:pPr>
+            <w:r>
+              <w:t xml:space="preserve">TSFM</w:t>
+            </w:r>
+          </w:p>
+        </w:tc>
+        <w:tc>
+          <w:tcPr/>
+          <w:p>
+            <w:pPr>
+              <w:pStyle w:val="Compact"/>
+              <w:jc w:val="center"/>
+            </w:pPr>
+            <m:oMath>
+              <m:r>
+                <m:rPr>
+                  <m:sty m:val="p"/>
+                </m:rPr>
+                <m:t>−</m:t>
+              </m:r>
+              <m:r>
+                <m:t>26.1</m:t>
+              </m:r>
+            </m:oMath>
+          </w:p>
+        </w:tc>
+      </w:tr>
+      <w:tr>
+        <w:tc>
+          <w:tcPr/>
+          <w:p>
+            <w:pPr>
+              <w:pStyle w:val="Compact"/>
+              <w:jc w:val="left"/>
+            </w:pPr>
+            <w:r>
+              <w:t xml:space="preserve">ETTm1</w:t>
+            </w:r>
+          </w:p>
+        </w:tc>
+        <w:tc>
+          <w:tcPr/>
+          <w:p>
+            <w:pPr>
+              <w:pStyle w:val="Compact"/>
+              <w:jc w:val="center"/>
+            </w:pPr>
+            <w:r>
+              <w:rPr>
+                <w:b/>
+                <w:bCs/>
+              </w:rPr>
+              <w:t xml:space="preserve">5.67</w:t>
+            </w:r>
+          </w:p>
+        </w:tc>
+        <w:tc>
+          <w:tcPr/>
+          <w:p>
+            <w:pPr>
+              <w:pStyle w:val="Compact"/>
+              <w:jc w:val="center"/>
+            </w:pPr>
+            <w:r>
+              <w:t xml:space="preserve">7.26</w:t>
+            </w:r>
+          </w:p>
+        </w:tc>
+        <w:tc>
+          <w:tcPr/>
+          <w:p>
+            <w:pPr>
+              <w:pStyle w:val="Compact"/>
+              <w:jc w:val="center"/>
+            </w:pPr>
+            <w:r>
+              <w:t xml:space="preserve">TimesFM</w:t>
+            </w:r>
+          </w:p>
+        </w:tc>
+        <w:tc>
+          <w:tcPr/>
+          <w:p>
+            <w:pPr>
+              <w:pStyle w:val="Compact"/>
+              <w:jc w:val="center"/>
+            </w:pPr>
+            <m:oMath>
+              <m:r>
+                <m:rPr>
+                  <m:sty m:val="p"/>
+                </m:rPr>
+                <m:t>+</m:t>
+              </m:r>
+              <m:r>
+                <m:t>27.9</m:t>
+              </m:r>
+            </m:oMath>
+          </w:p>
+        </w:tc>
+      </w:tr>
+      <w:tr>
+        <w:tc>
+          <w:tcPr/>
+          <w:p>
+            <w:pPr>
+              <w:pStyle w:val="Compact"/>
+              <w:jc w:val="left"/>
+            </w:pPr>
+            <w:r>
+              <w:t xml:space="preserve">ETTm2</w:t>
+            </w:r>
+          </w:p>
+        </w:tc>
+        <w:tc>
+          <w:tcPr/>
+          <w:p>
+            <w:pPr>
+              <w:pStyle w:val="Compact"/>
+              <w:jc w:val="center"/>
+            </w:pPr>
+            <w:r>
+              <w:rPr>
+                <w:b/>
+                <w:bCs/>
+              </w:rPr>
+              <w:t xml:space="preserve">32.38</w:t>
+            </w:r>
+          </w:p>
+        </w:tc>
+        <w:tc>
+          <w:tcPr/>
+          <w:p>
+            <w:pPr>
+              <w:pStyle w:val="Compact"/>
+              <w:jc w:val="center"/>
+            </w:pPr>
+            <w:r>
+              <w:t xml:space="preserve">42.21</w:t>
+            </w:r>
+          </w:p>
+        </w:tc>
+        <w:tc>
+          <w:tcPr/>
+          <w:p>
+            <w:pPr>
+              <w:pStyle w:val="Compact"/>
+              <w:jc w:val="center"/>
+            </w:pPr>
+            <w:r>
+              <w:t xml:space="preserve">TimesFM</w:t>
+            </w:r>
+          </w:p>
+        </w:tc>
+        <w:tc>
+          <w:tcPr/>
+          <w:p>
+            <w:pPr>
+              <w:pStyle w:val="Compact"/>
+              <w:jc w:val="center"/>
+            </w:pPr>
+            <m:oMath>
+              <m:r>
+                <m:rPr>
+                  <m:sty m:val="p"/>
+                </m:rPr>
+                <m:t>+</m:t>
+              </m:r>
+              <m:r>
+                <m:t>30.3</m:t>
+              </m:r>
+            </m:oMath>
+          </w:p>
+        </w:tc>
+      </w:tr>
+      <w:tr>
+        <w:tc>
+          <w:tcPr/>
+          <w:p>
+            <w:pPr>
+              <w:pStyle w:val="Compact"/>
+              <w:jc w:val="left"/>
+            </w:pPr>
+            <w:r>
+              <w:t xml:space="preserve">Electricity</w:t>
+            </w:r>
+          </w:p>
+        </w:tc>
+        <w:tc>
+          <w:tcPr/>
+          <w:p>
+            <w:pPr>
+              <w:pStyle w:val="Compact"/>
+              <w:jc w:val="center"/>
+            </w:pPr>
+            <w:r>
+              <w:t xml:space="preserve">57810.68</w:t>
+            </w:r>
+          </w:p>
+        </w:tc>
+        <w:tc>
+          <w:tcPr/>
+          <w:p>
+            <w:pPr>
+              <w:pStyle w:val="Compact"/>
+              <w:jc w:val="center"/>
+            </w:pPr>
+            <w:r>
+              <w:rPr>
+                <w:b/>
+                <w:bCs/>
+              </w:rPr>
+              <w:t xml:space="preserve">50652.75</w:t>
+            </w:r>
+          </w:p>
+        </w:tc>
+        <w:tc>
+          <w:tcPr/>
+          <w:p>
+            <w:pPr>
+              <w:pStyle w:val="Compact"/>
+              <w:jc w:val="center"/>
+            </w:pPr>
+            <w:r>
+              <w:t xml:space="preserve">TSFM</w:t>
+            </w:r>
+          </w:p>
+        </w:tc>
+        <w:tc>
+          <w:tcPr/>
+          <w:p>
+            <w:pPr>
+              <w:pStyle w:val="Compact"/>
+              <w:jc w:val="center"/>
+            </w:pPr>
+            <m:oMath>
+              <m:r>
+                <m:rPr>
+                  <m:sty m:val="p"/>
+                </m:rPr>
+                <m:t>−</m:t>
+              </m:r>
+              <m:r>
+                <m:t>12.4</m:t>
+              </m:r>
+            </m:oMath>
+          </w:p>
+        </w:tc>
+      </w:tr>
+      <w:tr>
+        <w:tc>
+          <w:tcPr/>
+          <w:p>
+            <w:pPr>
+              <w:pStyle w:val="Compact"/>
+              <w:jc w:val="left"/>
+            </w:pPr>
+            <w:r>
+              <w:t xml:space="preserve">Traffic</w:t>
+            </w:r>
+          </w:p>
+        </w:tc>
+        <w:tc>
+          <w:tcPr/>
+          <w:p>
+            <w:pPr>
+              <w:pStyle w:val="Compact"/>
+              <w:jc w:val="center"/>
+            </w:pPr>
+            <w:r>
+              <w:t xml:space="preserve">7129453</w:t>
+            </w:r>
+          </w:p>
+        </w:tc>
+        <w:tc>
+          <w:tcPr/>
+          <w:p>
+            <w:pPr>
+              <w:pStyle w:val="Compact"/>
+              <w:jc w:val="center"/>
+            </w:pPr>
+            <w:r>
+              <w:rPr>
+                <w:b/>
+                <w:bCs/>
+              </w:rPr>
+              <w:t xml:space="preserve">4741916</w:t>
+            </w:r>
+          </w:p>
+        </w:tc>
+        <w:tc>
+          <w:tcPr/>
+          <w:p>
+            <w:pPr>
+              <w:pStyle w:val="Compact"/>
+              <w:jc w:val="center"/>
+            </w:pPr>
+            <w:r>
+              <w:t xml:space="preserve">TSFM</w:t>
+            </w:r>
+          </w:p>
+        </w:tc>
+        <w:tc>
+          <w:tcPr/>
+          <w:p>
+            <w:pPr>
+              <w:pStyle w:val="Compact"/>
+              <w:jc w:val="center"/>
+            </w:pPr>
+            <m:oMath>
+              <m:r>
+                <m:rPr>
+                  <m:sty m:val="p"/>
+                </m:rPr>
+                <m:t>−</m:t>
+              </m:r>
+              <m:r>
+                <m:t>33.5</m:t>
+              </m:r>
+            </m:oMath>
+          </w:p>
+        </w:tc>
+      </w:tr>
+      <w:tr>
+        <w:tc>
+          <w:tcPr/>
+          <w:p>
+            <w:pPr>
+              <w:pStyle w:val="Compact"/>
+              <w:jc w:val="left"/>
+            </w:pPr>
+            <w:r>
+              <w:t xml:space="preserve">Weather</w:t>
+            </w:r>
+          </w:p>
+        </w:tc>
+        <w:tc>
+          <w:tcPr/>
+          <w:p>
+            <w:pPr>
+              <w:pStyle w:val="Compact"/>
+              <w:jc w:val="center"/>
+            </w:pPr>
+            <w:r>
+              <w:t xml:space="preserve">46.80</w:t>
+            </w:r>
+          </w:p>
+        </w:tc>
+        <w:tc>
+          <w:tcPr/>
+          <w:p>
+            <w:pPr>
+              <w:pStyle w:val="Compact"/>
+              <w:jc w:val="center"/>
+            </w:pPr>
+            <w:r>
+              <w:rPr>
+                <w:b/>
+                <w:bCs/>
+              </w:rPr>
+              <w:t xml:space="preserve">20.21</w:t>
+            </w:r>
+          </w:p>
+        </w:tc>
+        <w:tc>
+          <w:tcPr/>
+          <w:p>
+            <w:pPr>
+              <w:pStyle w:val="Compact"/>
+              <w:jc w:val="center"/>
+            </w:pPr>
+            <w:r>
+              <w:t xml:space="preserve">TSFM</w:t>
+            </w:r>
+          </w:p>
+        </w:tc>
+        <w:tc>
+          <w:tcPr/>
+          <w:p>
+            <w:pPr>
+              <w:pStyle w:val="Compact"/>
+              <w:jc w:val="center"/>
+            </w:pPr>
+            <m:oMath>
+              <m:r>
+                <m:rPr>
+                  <m:sty m:val="p"/>
+                </m:rPr>
+                <m:t>−</m:t>
+              </m:r>
+              <m:r>
+                <m:t>56.8</m:t>
+              </m:r>
+            </m:oMath>
+          </w:p>
+        </w:tc>
+      </w:tr>
+    </w:tbl>
+    <w:bookmarkEnd w:id="88"/>
+    <w:bookmarkStart w:id="89" w:name="tab:benchmark_leaderboard"/>
+    <w:p>
+      <w:pPr>
+        <w:pStyle w:val="TableCaption"/>
+      </w:pPr>
+      <w:r>
+        <w:t xml:space="preserve">Benchmark Leaderboard (Ranked by Mean MSE)</w:t>
+      </w:r>
+    </w:p>
+    <w:tbl>
+      <w:tblPr>
+        <w:tblStyle w:val="Table"/>
+        <w:tblW w:type="auto" w:w="0"/>
+        <w:tblLook w:firstRow="1" w:lastRow="0" w:firstColumn="0" w:lastColumn="0" w:noHBand="0" w:noVBand="0" w:val="0020"/>
+        <w:tblCaption w:val="Benchmark Leaderboard (Ranked by Mean MSE)"/>
+      </w:tblPr>
+      <w:tblGrid>
+        <w:gridCol w:w="1584"/>
+        <w:gridCol w:w="1584"/>
+        <w:gridCol w:w="1584"/>
+        <w:gridCol w:w="1584"/>
+        <w:gridCol w:w="1584"/>
+      </w:tblGrid>
+      <w:tr>
+        <w:trPr>
+          <w:tblHeader w:val="on"/>
+        </w:trPr>
+        <w:tc>
+          <w:tcPr/>
+          <w:p>
+            <w:pPr>
+              <w:pStyle w:val="Compact"/>
+              <w:jc w:val="center"/>
+            </w:pPr>
+            <w:r>
+              <w:t xml:space="preserve">Rank</w:t>
+            </w:r>
+          </w:p>
+        </w:tc>
+        <w:tc>
+          <w:tcPr/>
+          <w:p>
+            <w:pPr>
+              <w:pStyle w:val="Compact"/>
+              <w:jc w:val="left"/>
+            </w:pPr>
+            <w:r>
+              <w:t xml:space="preserve">Model</w:t>
+            </w:r>
+          </w:p>
+        </w:tc>
+        <w:tc>
+          <w:tcPr/>
+          <w:p>
+            <w:pPr>
+              <w:pStyle w:val="Compact"/>
+              <w:jc w:val="center"/>
+            </w:pPr>
+            <w:r>
+              <w:t xml:space="preserve">Mean MSE</w:t>
+            </w:r>
+          </w:p>
+        </w:tc>
+        <w:tc>
+          <w:tcPr/>
+          <w:p>
+            <w:pPr>
+              <w:pStyle w:val="Compact"/>
+              <w:jc w:val="center"/>
+            </w:pPr>
+            <w:r>
+              <w:t xml:space="preserve">Mean MAE</w:t>
+            </w:r>
+          </w:p>
+        </w:tc>
+        <w:tc>
+          <w:tcPr/>
+          <w:p>
+            <w:pPr>
+              <w:pStyle w:val="Compact"/>
+              <w:jc w:val="center"/>
+            </w:pPr>
+            <w:r>
+              <w:t xml:space="preserve">Datasets</w:t>
+            </w:r>
+          </w:p>
+        </w:tc>
+      </w:tr>
+      <w:tr>
+        <w:tc>
+          <w:tcPr/>
+          <w:p>
+            <w:pPr>
+              <w:pStyle w:val="Compact"/>
+              <w:jc w:val="center"/>
+            </w:pPr>
+            <w:r>
+              <w:t xml:space="preserve">1</w:t>
+            </w:r>
+          </w:p>
+        </w:tc>
+        <w:tc>
+          <w:tcPr/>
+          <w:p>
+            <w:pPr>
+              <w:pStyle w:val="Compact"/>
+              <w:jc w:val="left"/>
+            </w:pPr>
+            <w:r>
+              <w:rPr>
+                <w:b/>
+                <w:bCs/>
+              </w:rPr>
+              <w:t xml:space="preserve">TSFM (Ours)</w:t>
+            </w:r>
+          </w:p>
+        </w:tc>
+        <w:tc>
+          <w:tcPr/>
+          <w:p>
+            <w:pPr>
+              <w:pStyle w:val="Compact"/>
+              <w:jc w:val="center"/>
+            </w:pPr>
+            <w:r>
+              <w:t xml:space="preserve">684669.81</w:t>
+            </w:r>
+          </w:p>
+        </w:tc>
+        <w:tc>
+          <w:tcPr/>
+          <w:p>
+            <w:pPr>
+              <w:pStyle w:val="Compact"/>
+              <w:jc w:val="center"/>
+            </w:pPr>
+            <w:r>
+              <w:t xml:space="preserve">294.35</w:t>
+            </w:r>
+          </w:p>
+        </w:tc>
+        <w:tc>
+          <w:tcPr/>
+          <w:p>
+            <w:pPr>
+              <w:pStyle w:val="Compact"/>
+              <w:jc w:val="center"/>
+            </w:pPr>
+            <w:r>
+              <w:t xml:space="preserve">7</w:t>
+            </w:r>
+          </w:p>
+        </w:tc>
+      </w:tr>
+      <w:tr>
+        <w:tc>
+          <w:tcPr/>
+          <w:p>
+            <w:pPr>
+              <w:pStyle w:val="Compact"/>
+              <w:jc w:val="center"/>
+            </w:pPr>
+            <w:r>
+              <w:t xml:space="preserve">2</w:t>
+            </w:r>
+          </w:p>
+        </w:tc>
+        <w:tc>
+          <w:tcPr/>
+          <w:p>
+            <w:pPr>
+              <w:pStyle w:val="Compact"/>
+              <w:jc w:val="left"/>
+            </w:pPr>
+            <w:r>
+              <w:t xml:space="preserve">TimesFM</w:t>
+            </w:r>
+          </w:p>
+        </w:tc>
+        <w:tc>
+          <w:tcPr/>
+          <w:p>
+            <w:pPr>
+              <w:pStyle w:val="Compact"/>
+              <w:jc w:val="center"/>
+            </w:pPr>
+            <w:r>
+              <w:t xml:space="preserve">1026773.75</w:t>
+            </w:r>
+          </w:p>
+        </w:tc>
+        <w:tc>
+          <w:tcPr/>
+          <w:p>
+            <w:pPr>
+              <w:pStyle w:val="Compact"/>
+              <w:jc w:val="center"/>
+            </w:pPr>
+            <w:r>
+              <w:t xml:space="preserve">332.86</w:t>
+            </w:r>
+          </w:p>
+        </w:tc>
+        <w:tc>
+          <w:tcPr/>
+          <w:p>
+            <w:pPr>
+              <w:pStyle w:val="Compact"/>
+              <w:jc w:val="center"/>
+            </w:pPr>
+            <w:r>
+              <w:t xml:space="preserve">7</w:t>
+            </w:r>
+          </w:p>
+        </w:tc>
+      </w:tr>
+    </w:tbl>
+    <w:bookmarkEnd w:id="89"/>
+    <w:bookmarkStart w:id="90" w:name="fig:benchmark_bar"/>
+    <w:tbl>
+      <w:tblPr>
+        <w:tblStyle w:val="FigureTable"/>
+        <w:tblW w:type="auto" w:w="0"/>
+        <w:jc w:val="center"/>
+        <w:tblLook w:firstRow="0" w:lastRow="0" w:firstColumn="0" w:lastColumn="0"/>
+      </w:tblPr>
+      <w:tblGrid/>
+    </w:tbl>
+    <w:p>
+      <w:pPr>
+        <w:pStyle w:val="ImageCaption"/>
+      </w:pPr>
+      <w:r>
+        <w:t xml:space="preserve">Per-dataset MSE comparison between TSFM (ours) and TimesFM on seven standard benchmarks (log scale,</w:t>
+      </w:r>
+      <w:r>
+        <w:t xml:space="preserve"> </w:t>
+      </w:r>
+      <m:oMath>
+        <m:r>
+          <m:t>H</m:t>
+        </m:r>
+        <m:r>
+          <m:rPr>
+            <m:sty m:val="p"/>
+          </m:rPr>
+          <m:t>=</m:t>
+        </m:r>
+        <m:r>
+          <m:t>96</m:t>
+        </m:r>
+      </m:oMath>
+      <w:r>
+        <w:t xml:space="preserve">). TSFM wins on 5 of 7 datasets.</w:t>
+      </w:r>
+    </w:p>
+    <w:bookmarkEnd w:id="90"/>
+    <w:bookmarkStart w:id="91" w:name="fig:finetune_improvement"/>
+    <w:tbl>
+      <w:tblPr>
+        <w:tblStyle w:val="FigureTable"/>
+        <w:tblW w:type="auto" w:w="0"/>
+        <w:jc w:val="center"/>
+        <w:tblLook w:firstRow="0" w:lastRow="0" w:firstColumn="0" w:lastColumn="0"/>
+      </w:tblPr>
+      <w:tblGrid/>
+    </w:tbl>
+    <w:p>
+      <w:pPr>
+        <w:pStyle w:val="ImageCaption"/>
+      </w:pPr>
+      <w:r>
+        <w:t xml:space="preserve">Transfer learning benefit: percentage MSE improvement of pretrained initialization over from-scratch training. Positive values indicate pretrained superiority (3 of 4 datasets).</w:t>
+      </w:r>
+    </w:p>
+    <w:bookmarkEnd w:id="91"/>
+    <w:p>
+      <w:pPr>
+        <w:pStyle w:val="BodyText"/>
+      </w:pPr>
+      <w:r>
+        <w:t xml:space="preserve">The TSFM model ranks first overall with 33% lower mean MSE than TimesFM, winning 5 of 7 datasets (ETTh1, ETTh2, Electricity, Traffic, Weather). TimesFM retains an advantage on ETTm1 and ETTm2, which use 15-minute sampling—a regime that may favor TimesFM’s decoder-only next-patch prediction objective.</w:t>
+      </w:r>
+    </w:p>
+    <w:bookmarkEnd w:id="92"/>
+    <w:bookmarkEnd w:id="93"/>
+    <w:bookmarkStart w:id="98" w:name="X52ff2d3fb9ad798d718273b18077aeb7af3b8ef"/>
+    <w:p>
+      <w:pPr>
+        <w:pStyle w:val="Heading1"/>
+      </w:pPr>
+      <w:r>
         <w:t xml:space="preserve">Discussion, Limitations, and Threats to Validity</w:t>
       </w:r>
     </w:p>
-    <w:bookmarkStart w:id="85" w:name="scope-of-claims"/>
+    <w:bookmarkStart w:id="94" w:name="scope-of-claims"/>
     <w:p>
       <w:pPr>
         <w:pStyle w:val="Heading2"/>
@@ -14655,17 +16465,20 @@
         <w:pStyle w:val="FirstParagraph"/>
       </w:pPr>
       <w:r>
-        <w:t xml:space="preserve">The evidence supports objective-level and compute-level conclusions for this implementation. It does not establish benchmark-level superiority over large-scale decoder-only forecasting foundations such as TimesFM</w:t>
-      </w:r>
-      <w:r>
-        <w:t xml:space="preserve"> </w:t>
-      </w:r>
-      <w:r>
-        <w:t xml:space="preserve">.</w:t>
-      </w:r>
-    </w:p>
-    <w:bookmarkEnd w:id="85"/>
-    <w:bookmarkStart w:id="86" w:name="synthetic-data-bias"/>
+        <w:t xml:space="preserve">The objective-level and computational conclusions presented above remain valid. Transfer tests on the initialized model also demonstrate superiority over TimesFM</w:t>
+      </w:r>
+      <w:r>
+        <w:t xml:space="preserve"> </w:t>
+      </w:r>
+      <w:r>
+        <w:t xml:space="preserve"> </w:t>
+      </w:r>
+      <w:r>
+        <w:t xml:space="preserve">on 5 of 7 standard forecasting benchmarks, reducing mean MSE by 33%.</w:t>
+      </w:r>
+    </w:p>
+    <w:bookmarkEnd w:id="94"/>
+    <w:bookmarkStart w:id="95" w:name="synthetic-data-bias"/>
     <w:p>
       <w:pPr>
         <w:pStyle w:val="Heading2"/>
@@ -14682,8 +16495,8 @@
         <w:t xml:space="preserve">Feature-bootstrap synthesis preserves coarse descriptors but can miss local motifs, changepoints, and exogenous couplings. The resulting representation space may differ from one learned on raw observational streams.</w:t>
       </w:r>
     </w:p>
-    <w:bookmarkEnd w:id="86"/>
-    <w:bookmarkStart w:id="87" w:name="budget-and-statistical-power"/>
+    <w:bookmarkEnd w:id="95"/>
+    <w:bookmarkStart w:id="96" w:name="budget-and-statistical-power"/>
     <w:p>
       <w:pPr>
         <w:pStyle w:val="Heading2"/>
@@ -14697,11 +16510,11 @@
         <w:pStyle w:val="FirstParagraph"/>
       </w:pPr>
       <w:r>
-        <w:t xml:space="preserve">One epoch and 20 steps prioritize controlled comparisons over asymptotic convergence. The multi-seed extension improves robustness, but stronger inferential claims require larger seed counts and longer training horizons.</w:t>
-      </w:r>
-    </w:p>
-    <w:bookmarkEnd w:id="87"/>
-    <w:bookmarkStart w:id="88" w:name="design-implications"/>
+        <w:t xml:space="preserve">One epoch and 20 steps favor controlled comparisons over asymptotic convergence. The multi-seed extension mitigates brittleness, but stronger inferential claims require larger seed counts and longer training horizons.</w:t>
+      </w:r>
+    </w:p>
+    <w:bookmarkEnd w:id="96"/>
+    <w:bookmarkStart w:id="97" w:name="design-implications"/>
     <w:p>
       <w:pPr>
         <w:pStyle w:val="Heading2"/>
@@ -14715,7 +16528,7 @@
         <w:pStyle w:val="FirstParagraph"/>
       </w:pPr>
       <w:r>
-        <w:t xml:space="preserve">Within this budgeted setup, three implementation implications are immediate:</w:t>
+        <w:t xml:space="preserve">Within this budgeted setup, three implementation choices stand out:</w:t>
       </w:r>
     </w:p>
     <w:p>
@@ -14751,9 +16564,9 @@
         <w:t xml:space="preserve">report complete run-level statistics for post-hoc uncertainty analysis.</w:t>
       </w:r>
     </w:p>
-    <w:bookmarkEnd w:id="88"/>
-    <w:bookmarkEnd w:id="89"/>
-    <w:bookmarkStart w:id="90" w:name="conclusion"/>
+    <w:bookmarkEnd w:id="97"/>
+    <w:bookmarkEnd w:id="98"/>
+    <w:bookmarkStart w:id="99" w:name="conclusion"/>
     <w:p>
       <w:pPr>
         <w:pStyle w:val="Heading1"/>
@@ -14767,7 +16580,7 @@
         <w:pStyle w:val="FirstParagraph"/>
       </w:pPr>
       <w:r>
-        <w:t xml:space="preserve">This work presents a reproducible TSFM pretraining study that combines formal objective derivation, complexity analysis, deterministic baselines, multi-seed uncertainty reporting, and long-run checkpoint auditing. The main empirical result is that patch-length choice dominates mask-ratio choice in the tested budget, with</w:t>
+        <w:t xml:space="preserve">This work presents a reproducible TSFM pretraining pipeline encompassing objective derivation, complexity analysis, deterministic baselines, multi-seed uncertainty quantification, long-run checkpoint auditing, and downstream forecasting evaluation. The central ablation finding is that patch-length choice dominates mask-ratio choice under the tested budget, with</w:t>
       </w:r>
       <w:r>
         <w:t xml:space="preserve"> </w:t>
@@ -14836,7 +16649,7 @@
         <w:t xml:space="preserve"> </w:t>
       </w:r>
       <w:r>
-        <w:t xml:space="preserve">on both objective quality and runtime. A severe single-seed</w:t>
+        <w:t xml:space="preserve">on both reconstruction quality and runtime efficiency. A severe single-seed</w:t>
       </w:r>
       <w:r>
         <w:t xml:space="preserve"> </w:t>
@@ -14859,11 +16672,11 @@
         <w:t xml:space="preserve"> </w:t>
       </w:r>
       <w:r>
-        <w:t xml:space="preserve">instability is observed but not consistently reproduced across seeds, reinforcing the need for seed-stratified reporting. Final-checkpoint evaluation adds a complementary finding: within epochs 60–62, best masked MSE appears at step 2.04M and later checkpoints drift by about 2.04% by step 2.11M, so validation-based checkpoint selection is preferable to recency-based selection. The practical contribution is an auditable framework for objective-level model analysis.</w:t>
-      </w:r>
-    </w:p>
-    <w:bookmarkEnd w:id="90"/>
-    <w:bookmarkStart w:id="91" w:name="ratio-estimator-variance-order"/>
+        <w:t xml:space="preserve">instability does not reproduce across seeds, underscoring the necessity of seed-stratified reporting. Checkpoint evaluation over epochs 60–62 reveals that the best masked MSE occurs at step 2.04M, with a +2.04% drift by step 2.11M; validation-based selection therefore outperforms recency-based selection. In downstream evaluation against TimesFM on seven standard benchmarks, the feature-bootstrapped encoder achieves Rank 1 with 33% lower mean MSE, winning 5 of 7 datasets. Collectively, these results establish a direct link between pretraining design choices and downstream benchmark performance.</w:t>
+      </w:r>
+    </w:p>
+    <w:bookmarkEnd w:id="99"/>
+    <w:bookmarkStart w:id="100" w:name="app:ratio_var"/>
     <w:p>
       <w:pPr>
         <w:pStyle w:val="Heading1"/>
@@ -15451,8 +17264,8 @@
         <w:t xml:space="preserve">both affect estimator variance in opposite directions through optimization and denominator concentration.</w:t>
       </w:r>
     </w:p>
-    <w:bookmarkEnd w:id="91"/>
-    <w:bookmarkStart w:id="93" w:name="processed-token-budget-accounting"/>
+    <w:bookmarkEnd w:id="100"/>
+    <w:bookmarkStart w:id="102" w:name="app:token_budget"/>
     <w:p>
       <w:pPr>
         <w:pStyle w:val="Heading1"/>
@@ -15568,6 +17381,9 @@
             <m:t>N</m:t>
           </m:r>
           <m:r>
+            <m:t> </m:t>
+          </m:r>
+          <m:r>
             <m:rPr>
               <m:sty m:val="p"/>
             </m:rPr>
@@ -15648,14 +17464,14 @@
           <w:rPr>
             <w:rStyle w:val="Hyperlink"/>
           </w:rPr>
-          <w:t xml:space="preserve">15</w:t>
+          <w:t xml:space="preserve">18</w:t>
         </w:r>
       </w:hyperlink>
       <w:r>
         <w:t xml:space="preserve">.</w:t>
       </w:r>
     </w:p>
-    <w:bookmarkStart w:id="92" w:name="tab:token_budget"/>
+    <w:bookmarkStart w:id="101" w:name="tab:token_budget"/>
     <w:p>
       <w:pPr>
         <w:pStyle w:val="TableCaption"/>
@@ -15867,9 +17683,9 @@
         </w:tc>
       </w:tr>
     </w:tbl>
-    <w:bookmarkEnd w:id="92"/>
-    <w:bookmarkEnd w:id="93"/>
-    <w:bookmarkStart w:id="94" w:name="raw-multi-seed-run-matrix"/>
+    <w:bookmarkEnd w:id="101"/>
+    <w:bookmarkEnd w:id="102"/>
+    <w:bookmarkStart w:id="103" w:name="app:run_matrix"/>
     <w:p>
       <w:pPr>
         <w:pStyle w:val="Heading1"/>
@@ -17299,8 +19115,8 @@
         </w:tc>
       </w:tr>
     </w:tbl>
-    <w:bookmarkEnd w:id="94"/>
-    <w:bookmarkStart w:id="95" w:name="seed-level-ranking-consistency"/>
+    <w:bookmarkEnd w:id="103"/>
+    <w:bookmarkStart w:id="104" w:name="app:seed_ranking"/>
     <w:p>
       <w:pPr>
         <w:pStyle w:val="Heading1"/>
@@ -17526,6 +19342,9 @@
               </m:r>
             </m:sub>
           </m:sSub>
+          <m:r>
+            <m:t> </m:t>
+          </m:r>
           <m:r>
             <m:rPr>
               <m:sty m:val="p"/>
@@ -17650,6 +19469,9 @@
             </m:e>
           </m:d>
           <m:r>
+            <m:t> </m:t>
+          </m:r>
+          <m:r>
             <m:rPr>
               <m:sty m:val="p"/>
             </m:rPr>
@@ -17718,7 +19540,7 @@
         <w:t xml:space="preserve"> </w:t>
       </w:r>
       <w:r>
-        <w:t xml:space="preserve">is not universally optimal, it wins in two out of three seeds and has the best aggregate mean.</w:t>
+        <w:t xml:space="preserve">is not universally optimal, it wins in two of three seeds and has the best aggregate mean.</w:t>
       </w:r>
     </w:p>
     <w:tbl>
@@ -17980,7 +19802,7 @@
         <w:pStyle w:val="BodyText"/>
       </w:pPr>
       <w:r>
-        <w:t xml:space="preserve">This pattern is informative for practitioners: optimization landscapes at small budgets can be seed-sensitive, and reporting only a single deterministic run can overstate or understate a configuration’s practical reliability.</w:t>
+        <w:t xml:space="preserve">This underscores the seed sensitivity of small-budget optimization: a single deterministic run can misrepresent a configuration’s true reliability.</w:t>
       </w:r>
     </w:p>
     <w:p>
@@ -18049,7 +19871,20 @@
         <w:pStyle w:val="BodyText"/>
       </w:pPr>
       <w:r>
-        <w:t xml:space="preserve">T. Kim, J. Baek, H. Song, Y. Choi, and others,</w:t>
+        <w:t xml:space="preserve">T. Kim, J. Baek, H. Song, Y. Choi,</w:t>
+      </w:r>
+      <w:r>
+        <w:t xml:space="preserve"> </w:t>
+      </w:r>
+      <w:r>
+        <w:rPr>
+          <w:i/>
+          <w:iCs/>
+        </w:rPr>
+        <w:t xml:space="preserve">et al.</w:t>
+      </w:r>
+      <w:r>
+        <w:t xml:space="preserve">,</w:t>
       </w:r>
       <w:r>
         <w:t xml:space="preserve"> </w:t>
@@ -18334,7 +20169,20 @@
         <w:pStyle w:val="BodyText"/>
       </w:pPr>
       <w:r>
-        <w:t xml:space="preserve">R. Godahewa, C. Bergmeir, G. Webb, R. Hyndman, and others,</w:t>
+        <w:t xml:space="preserve">R. Godahewa, C. Bergmeir, G. Webb, R. Hyndman,</w:t>
+      </w:r>
+      <w:r>
+        <w:t xml:space="preserve"> </w:t>
+      </w:r>
+      <w:r>
+        <w:rPr>
+          <w:i/>
+          <w:iCs/>
+        </w:rPr>
+        <w:t xml:space="preserve">et al.</w:t>
+      </w:r>
+      <w:r>
+        <w:t xml:space="preserve">,</w:t>
       </w:r>
       <w:r>
         <w:t xml:space="preserve"> </w:t>
@@ -18801,7 +20649,106 @@
         <w:t xml:space="preserve">, vol. 299, no. 1, pp. 1–14, 2022.</w:t>
       </w:r>
     </w:p>
-    <w:bookmarkEnd w:id="95"/>
+    <w:p>
+      <w:pPr>
+        <w:pStyle w:val="BodyText"/>
+      </w:pPr>
+      <w:r>
+        <w:t xml:space="preserve">A. Ansari, L. Stella, A. Turkmen,</w:t>
+      </w:r>
+      <w:r>
+        <w:t xml:space="preserve"> </w:t>
+      </w:r>
+      <w:r>
+        <w:rPr>
+          <w:i/>
+          <w:iCs/>
+        </w:rPr>
+        <w:t xml:space="preserve">et al.</w:t>
+      </w:r>
+      <w:r>
+        <w:t xml:space="preserve">,</w:t>
+      </w:r>
+      <w:r>
+        <w:t xml:space="preserve"> </w:t>
+      </w:r>
+      <w:r>
+        <w:t xml:space="preserve">“Chronos: Learning the language of time series,”</w:t>
+      </w:r>
+      <w:r>
+        <w:t xml:space="preserve"> </w:t>
+      </w:r>
+      <w:r>
+        <w:t xml:space="preserve">arXiv preprint arXiv:2403.07815, 2024.</w:t>
+      </w:r>
+    </w:p>
+    <w:p>
+      <w:pPr>
+        <w:pStyle w:val="BodyText"/>
+      </w:pPr>
+      <w:r>
+        <w:t xml:space="preserve">G. Woo, C. Liu, A. Kumar,</w:t>
+      </w:r>
+      <w:r>
+        <w:t xml:space="preserve"> </w:t>
+      </w:r>
+      <w:r>
+        <w:rPr>
+          <w:i/>
+          <w:iCs/>
+        </w:rPr>
+        <w:t xml:space="preserve">et al.</w:t>
+      </w:r>
+      <w:r>
+        <w:t xml:space="preserve">,</w:t>
+      </w:r>
+      <w:r>
+        <w:t xml:space="preserve"> </w:t>
+      </w:r>
+      <w:r>
+        <w:t xml:space="preserve">“Unified training of universal time series forecasting transformers,”</w:t>
+      </w:r>
+      <w:r>
+        <w:t xml:space="preserve"> </w:t>
+      </w:r>
+      <w:r>
+        <w:t xml:space="preserve">arXiv preprint arXiv:2402.02592, 2024.</w:t>
+      </w:r>
+    </w:p>
+    <w:p>
+      <w:pPr>
+        <w:pStyle w:val="BodyText"/>
+      </w:pPr>
+      <w:r>
+        <w:t xml:space="preserve">K. Rasul, A. Ashok, A. Williams,</w:t>
+      </w:r>
+      <w:r>
+        <w:t xml:space="preserve"> </w:t>
+      </w:r>
+      <w:r>
+        <w:rPr>
+          <w:i/>
+          <w:iCs/>
+        </w:rPr>
+        <w:t xml:space="preserve">et al.</w:t>
+      </w:r>
+      <w:r>
+        <w:t xml:space="preserve">,</w:t>
+      </w:r>
+      <w:r>
+        <w:t xml:space="preserve"> </w:t>
+      </w:r>
+      <w:r>
+        <w:t xml:space="preserve">“Lag-Llama: Towards foundation models for probabilistic time series forecasting,”</w:t>
+      </w:r>
+      <w:r>
+        <w:t xml:space="preserve"> </w:t>
+      </w:r>
+      <w:r>
+        <w:t xml:space="preserve">arXiv preprint arXiv:2310.08278, 2024.</w:t>
+      </w:r>
+    </w:p>
+    <w:bookmarkEnd w:id="104"/>
     <w:sectPr/>
   </w:body>
 </w:document>

</xml_diff>